<commit_message>
docs: rewrite project progress report from repo inception and update 10/10 AI-first specs
</commit_message>
<xml_diff>
--- a/BAO_CAO_TIEN_DO_28_10_2026.docx
+++ b/BAO_CAO_TIEN_DO_28_10_2026.docx
@@ -4,43 +4,44 @@
   <w:body>
     <w:p>
       <w:pPr>
-        <w:jc w:val="right"/>
+        <w:spacing w:before="0" w:after="40"/>
       </w:pPr>
       <w:r>
         <w:rPr>
+          <w:rFonts w:ascii="Arial" w:hAnsi="Arial"/>
           <w:b/>
-          <w:color w:val="7F7F7F"/>
-          <w:sz w:val="17"/>
+          <w:color w:val="2563EB"/>
+          <w:sz w:val="19"/>
         </w:rPr>
-        <w:t>DỰ ÁN FILM CONTEST MONOREPO  |  TECHNICAL MANAGEMENT</w:t>
+        <w:t>DỰ ÁN FILM CONTEST MONOREPO  |  TECHNICAL MANAGEMENT &amp; ENGINEERING</w:t>
       </w:r>
     </w:p>
     <w:p>
       <w:pPr>
-        <w:spacing w:before="120" w:after="80"/>
-        <w:jc w:val="center"/>
+        <w:spacing w:before="40" w:after="40"/>
       </w:pPr>
       <w:r>
         <w:rPr>
+          <w:rFonts w:ascii="Arial" w:hAnsi="Arial"/>
           <w:b/>
-          <w:color w:val="1F4E78"/>
-          <w:sz w:val="32"/>
+          <w:color w:val="0F172A"/>
+          <w:sz w:val="38"/>
         </w:rPr>
-        <w:t>BÁO CÁO TIẾN ĐỘ &amp; RÀ SOÁT KỸ THUẬT DỰ ÁN</w:t>
+        <w:t>BÁO CÁO TỔNG KẾT TIẾN ĐỘ &amp; THÀNH QUẢ DỰ ÁN</w:t>
       </w:r>
     </w:p>
     <w:p>
       <w:pPr>
-        <w:spacing w:after="280"/>
-        <w:jc w:val="center"/>
+        <w:spacing w:before="0" w:after="240"/>
       </w:pPr>
       <w:r>
         <w:rPr>
+          <w:rFonts w:ascii="Arial" w:hAnsi="Arial"/>
           <w:i/>
-          <w:color w:val="595959"/>
-          <w:sz w:val="21"/>
+          <w:color w:val="475569"/>
+          <w:sz w:val="22"/>
         </w:rPr>
-        <w:t>Tổng kết công việc ngày 28/10/2026 – Ban hành Chuẩn AI-First Specs &amp; Đánh giá nhân sự</w:t>
+        <w:t>Tổng quan thành quả kỹ thuật từ ngày khởi tạo Monorepo đến nay (08/10/2026 – 28/10/2026)</w:t>
       </w:r>
     </w:p>
     <w:tbl>
@@ -49,55 +50,87 @@
         <w:jc w:val="center"/>
         <w:tblLayout w:type="fixed"/>
         <w:tblLook w:firstColumn="1" w:firstRow="1" w:lastColumn="0" w:lastRow="0" w:noHBand="0" w:noVBand="1" w:val="04A0"/>
+        <w:tblBorders>
+          <w:top w:val="single" w:sz="4" w:space="0" w:color="E2E8F0"/>
+          <w:bottom w:val="single" w:sz="4" w:space="0" w:color="E2E8F0"/>
+          <w:insideH w:val="single" w:sz="4" w:space="0" w:color="E2E8F0"/>
+          <w:insideV w:val="none"/>
+          <w:left w:val="none"/>
+          <w:right w:val="none"/>
+        </w:tblBorders>
       </w:tblPr>
       <w:tblGrid>
-        <w:gridCol w:w="4968"/>
-        <w:gridCol w:w="4968"/>
+        <w:gridCol w:w="5184"/>
+        <w:gridCol w:w="5184"/>
       </w:tblGrid>
       <w:tr>
         <w:tc>
           <w:tcPr>
-            <w:tcW w:type="dxa" w:w="4752"/>
-            <w:shd w:fill="F2F5F9"/>
+            <w:tcW w:type="dxa" w:w="5184"/>
+            <w:shd w:fill="F8FAFC"/>
             <w:tcMar>
-              <w:top w:w="80" w:type="dxa"/>
-              <w:bottom w:w="80" w:type="dxa"/>
-              <w:left w:w="120" w:type="dxa"/>
-              <w:right w:w="120" w:type="dxa"/>
+              <w:top w:w="100" w:type="dxa"/>
+              <w:bottom w:w="100" w:type="dxa"/>
+              <w:left w:w="140" w:type="dxa"/>
+              <w:right w:w="140" w:type="dxa"/>
             </w:tcMar>
+            <w:vAlign w:val="center"/>
           </w:tcPr>
           <w:p>
+            <w:pPr>
+              <w:spacing w:before="0" w:after="0"/>
+            </w:pPr>
             <w:r>
               <w:rPr>
+                <w:rFonts w:ascii="Arial" w:hAnsi="Arial"/>
                 <w:b/>
+                <w:color w:val="1E293B"/>
+                <w:sz w:val="19"/>
               </w:rPr>
-              <w:t xml:space="preserve">📅 Ngày lập báo cáo: </w:t>
+              <w:t>📅 Thời gian tổng kết:</w:t>
             </w:r>
             <w:r>
-              <w:t>28/10/2026</w:t>
+              <w:rPr>
+                <w:rFonts w:ascii="Arial" w:hAnsi="Arial"/>
+                <w:color w:val="334155"/>
+                <w:sz w:val="19"/>
+              </w:rPr>
+              <w:t xml:space="preserve"> 08/10/2026 – 28/10/2026</w:t>
             </w:r>
           </w:p>
         </w:tc>
         <w:tc>
           <w:tcPr>
-            <w:tcW w:type="dxa" w:w="4752"/>
-            <w:shd w:fill="F2F5F9"/>
+            <w:tcW w:type="dxa" w:w="5184"/>
+            <w:shd w:fill="F8FAFC"/>
             <w:tcMar>
-              <w:top w:w="80" w:type="dxa"/>
-              <w:bottom w:w="80" w:type="dxa"/>
-              <w:left w:w="120" w:type="dxa"/>
-              <w:right w:w="120" w:type="dxa"/>
+              <w:top w:w="100" w:type="dxa"/>
+              <w:bottom w:w="100" w:type="dxa"/>
+              <w:left w:w="140" w:type="dxa"/>
+              <w:right w:w="140" w:type="dxa"/>
             </w:tcMar>
+            <w:vAlign w:val="center"/>
           </w:tcPr>
           <w:p>
+            <w:pPr>
+              <w:spacing w:before="0" w:after="0"/>
+            </w:pPr>
             <w:r>
               <w:rPr>
+                <w:rFonts w:ascii="Arial" w:hAnsi="Arial"/>
                 <w:b/>
+                <w:color w:val="1E293B"/>
+                <w:sz w:val="19"/>
               </w:rPr>
-              <w:t xml:space="preserve">👤 Người lập: </w:t>
+              <w:t>👤 Người lập báo cáo:</w:t>
             </w:r>
             <w:r>
-              <w:t>Technical Lead / Hoang Nam</w:t>
+              <w:rPr>
+                <w:rFonts w:ascii="Arial" w:hAnsi="Arial"/>
+                <w:color w:val="334155"/>
+                <w:sz w:val="19"/>
+              </w:rPr>
+              <w:t xml:space="preserve"> Technical Lead / Hoàng Nam</w:t>
             </w:r>
           </w:p>
         </w:tc>
@@ -105,47 +138,71 @@
       <w:tr>
         <w:tc>
           <w:tcPr>
-            <w:tcW w:type="dxa" w:w="4752"/>
-            <w:shd w:fill="F2F5F9"/>
+            <w:tcW w:type="dxa" w:w="5184"/>
+            <w:shd w:fill="F8FAFC"/>
             <w:tcMar>
-              <w:top w:w="80" w:type="dxa"/>
-              <w:bottom w:w="80" w:type="dxa"/>
-              <w:left w:w="120" w:type="dxa"/>
-              <w:right w:w="120" w:type="dxa"/>
+              <w:top w:w="100" w:type="dxa"/>
+              <w:bottom w:w="100" w:type="dxa"/>
+              <w:left w:w="140" w:type="dxa"/>
+              <w:right w:w="140" w:type="dxa"/>
             </w:tcMar>
+            <w:vAlign w:val="center"/>
           </w:tcPr>
           <w:p>
+            <w:pPr>
+              <w:spacing w:before="0" w:after="0"/>
+            </w:pPr>
             <w:r>
               <w:rPr>
+                <w:rFonts w:ascii="Arial" w:hAnsi="Arial"/>
                 <w:b/>
+                <w:color w:val="1E293B"/>
+                <w:sz w:val="19"/>
               </w:rPr>
-              <w:t xml:space="preserve">🌿 Nhánh kiểm thử: </w:t>
+              <w:t>🌿 Nhánh kiểm thử &amp; làm việc:</w:t>
             </w:r>
             <w:r>
-              <w:t>develop (commit d4e8ce7)</w:t>
+              <w:rPr>
+                <w:rFonts w:ascii="Arial" w:hAnsi="Arial"/>
+                <w:color w:val="334155"/>
+                <w:sz w:val="19"/>
+              </w:rPr>
+              <w:t xml:space="preserve"> develop (Đã merge 10/10 specs)</w:t>
             </w:r>
           </w:p>
         </w:tc>
         <w:tc>
           <w:tcPr>
-            <w:tcW w:type="dxa" w:w="4752"/>
-            <w:shd w:fill="F2F5F9"/>
+            <w:tcW w:type="dxa" w:w="5184"/>
+            <w:shd w:fill="F8FAFC"/>
             <w:tcMar>
-              <w:top w:w="80" w:type="dxa"/>
-              <w:bottom w:w="80" w:type="dxa"/>
-              <w:left w:w="120" w:type="dxa"/>
-              <w:right w:w="120" w:type="dxa"/>
+              <w:top w:w="100" w:type="dxa"/>
+              <w:bottom w:w="100" w:type="dxa"/>
+              <w:left w:w="140" w:type="dxa"/>
+              <w:right w:w="140" w:type="dxa"/>
             </w:tcMar>
+            <w:vAlign w:val="center"/>
           </w:tcPr>
           <w:p>
+            <w:pPr>
+              <w:spacing w:before="0" w:after="0"/>
+            </w:pPr>
             <w:r>
               <w:rPr>
+                <w:rFonts w:ascii="Arial" w:hAnsi="Arial"/>
                 <w:b/>
+                <w:color w:val="1E293B"/>
+                <w:sz w:val="19"/>
               </w:rPr>
-              <w:t xml:space="preserve">🎯 Trọng tâm: </w:t>
+              <w:t>🎯 Trọng tâm:</w:t>
             </w:r>
             <w:r>
-              <w:t>Đặc tả AI-First, Rà soát PRs, Đánh giá thành viên</w:t>
+              <w:rPr>
+                <w:rFonts w:ascii="Arial" w:hAnsi="Arial"/>
+                <w:color w:val="334155"/>
+                <w:sz w:val="19"/>
+              </w:rPr>
+              <w:t xml:space="preserve"> Toàn bộ Monorepo (API, Web, Mobile, AI Specs)</w:t>
             </w:r>
           </w:p>
         </w:tc>
@@ -153,123 +210,21 @@
     </w:tbl>
     <w:p>
       <w:pPr>
-        <w:spacing w:after="120"/>
+        <w:spacing w:before="160" w:after="0"/>
       </w:pPr>
     </w:p>
     <w:p>
       <w:pPr>
-        <w:keepNext/>
-        <w:spacing w:before="240" w:after="100"/>
+        <w:spacing w:before="160" w:after="80"/>
       </w:pPr>
       <w:r>
         <w:rPr>
+          <w:rFonts w:ascii="Arial" w:hAnsi="Arial"/>
           <w:b/>
-          <w:color w:val="1F4E78"/>
-          <w:sz w:val="24"/>
+          <w:color w:val="1E3A8A"/>
+          <w:sz w:val="26"/>
         </w:rPr>
-        <w:t>I. TỔNG QUAN CÔNG VIỆC HOÀN THÀNH NGÀY 28/10/2026</w:t>
-      </w:r>
-    </w:p>
-    <w:p>
-      <w:r>
-        <w:t xml:space="preserve">Trong ngày 28/10/2026, đội ngũ kỹ thuật đã rà soát toàn bộ tài liệu đặc tả hệ thống (Specifications) sau khi đối chiếu với tài liệu yêu cầu phần mềm </w:t>
-      </w:r>
-      <w:r>
-        <w:rPr>
-          <w:b/>
-        </w:rPr>
-        <w:t>SRS (Software Requirement Specification)</w:t>
-      </w:r>
-      <w:r>
-        <w:t xml:space="preserve"> từ Google Docs. Các kết quả trọng tâm đạt được bao gồm:</w:t>
-      </w:r>
-    </w:p>
-    <w:p>
-      <w:pPr>
-        <w:pStyle w:val="ListBullet"/>
-        <w:spacing w:after="40"/>
-      </w:pPr>
-      <w:r>
-        <w:rPr>
-          <w:b/>
-        </w:rPr>
-        <w:t xml:space="preserve">Tích hợp thành công 8 Pull Requests vào nhánh develop: </w:t>
-      </w:r>
-      <w:r>
-        <w:t>Rà soát và merge 8 PR bao gồm các module Auth &amp; RBAC (PR #65), Analog Master Data (PR #66), Film Logbook (PR #57), Submission &amp; Proof (PR #58), AI Verification (PR #63), Archive &amp; Exhibition (PR #59), Shared API Contracts (PR #60), Database &amp; Storage (PR #64).</w:t>
-      </w:r>
-    </w:p>
-    <w:p>
-      <w:pPr>
-        <w:pStyle w:val="ListBullet"/>
-        <w:spacing w:after="40"/>
-      </w:pPr>
-      <w:r>
-        <w:rPr>
-          <w:b/>
-        </w:rPr>
-        <w:t xml:space="preserve">Chuẩn hóa cấu trúc thư mục tài liệu: </w:t>
-      </w:r>
-      <w:r>
-        <w:t>Phát hiện và khắc phục tình trạng phân tán tài liệu (file nằm rải rác ở film-contest-specs/ và docs/specs/). Toàn bộ các module đặc tả đã được gom về thư mục duy nhất docs/ với tiền tố số thứ tự từ 01 đến 10 rõ ràng, đã commit và push thành công lên origin/develop.</w:t>
-      </w:r>
-    </w:p>
-    <w:p>
-      <w:pPr>
-        <w:pStyle w:val="ListBullet"/>
-        <w:spacing w:after="40"/>
-      </w:pPr>
-      <w:r>
-        <w:rPr>
-          <w:b/>
-        </w:rPr>
-        <w:t xml:space="preserve">Cập nhật tài liệu Monorepo (README.md): </w:t>
-      </w:r>
-      <w:r>
-        <w:t>Bổ sung mục lục và bảng tra cứu toàn bộ 10 module kỹ thuật cùng quy chuẩn viết đặc tả AI-First cho các thành viên trong nhóm.</w:t>
-      </w:r>
-    </w:p>
-    <w:p>
-      <w:pPr>
-        <w:pStyle w:val="ListBullet"/>
-        <w:spacing w:after="40"/>
-      </w:pPr>
-      <w:r>
-        <w:rPr>
-          <w:b/>
-        </w:rPr>
-        <w:t xml:space="preserve">Xác thực hạ tầng dữ liệu và lưu trữ đám mây: </w:t>
-      </w:r>
-      <w:r>
-        <w:t>Thống nhất thiết kế schema PostgreSQL 16 tích hợp extension pgvector phục vụ so khớp vector ảnh và giải pháp lưu trữ đa đám mây Cloudflare R2 / AWS S3 với Presigned URLs.</w:t>
-      </w:r>
-    </w:p>
-    <w:p>
-      <w:pPr>
-        <w:keepNext/>
-        <w:spacing w:before="240" w:after="100"/>
-      </w:pPr>
-      <w:r>
-        <w:rPr>
-          <w:b/>
-          <w:color w:val="1F4E78"/>
-          <w:sz w:val="24"/>
-        </w:rPr>
-        <w:t>II. BAN HÀNH QUY CHUẨN ĐẶC TẢ 'AI-FIRST SPECIFICATION'</w:t>
-      </w:r>
-    </w:p>
-    <w:p>
-      <w:r>
-        <w:t xml:space="preserve">Nhằm phục vụ định hướng phát triển phần mềm hiện đại với sự hỗ trợ của các trợ lý lập trình trí tuệ nhân tạo (Cursor, GitHub Copilot, Antigravity) và đảm bảo tính nhất quán tuyệt đối giữa Backend, Web Frontend và Flutter Mobile, nhóm đã chính thức ban hành </w:t>
-      </w:r>
-      <w:r>
-        <w:rPr>
-          <w:b/>
-        </w:rPr>
-        <w:t>Khung chuẩn 5 phần bắt buộc</w:t>
-      </w:r>
-      <w:r>
-        <w:t xml:space="preserve"> cho mọi tài liệu đặc tả kỹ thuật (Single Source of Truth - Zero Ambiguity):</w:t>
+        <w:t>I. BẢNG CHỈ SỐ NĂNG LỰC &amp; THÀNH QUẢ TỔNG QUAN</w:t>
       </w:r>
     </w:p>
     <w:tbl>
@@ -278,85 +233,375 @@
         <w:jc w:val="center"/>
         <w:tblLayout w:type="fixed"/>
         <w:tblLook w:firstColumn="1" w:firstRow="1" w:lastColumn="0" w:lastRow="0" w:noHBand="0" w:noVBand="1" w:val="04A0"/>
+        <w:tblBorders>
+          <w:top w:val="single" w:sz="4" w:space="0" w:color="3B82F6"/>
+          <w:bottom w:val="single" w:sz="4" w:space="0" w:color="3B82F6"/>
+          <w:left w:val="single" w:sz="4" w:space="0" w:color="3B82F6"/>
+          <w:right w:val="single" w:sz="4" w:space="0" w:color="3B82F6"/>
+          <w:insideH w:val="single" w:sz="4" w:space="0" w:color="3B82F6"/>
+          <w:insideV w:val="single" w:sz="4" w:space="0" w:color="3B82F6"/>
+        </w:tblBorders>
       </w:tblPr>
       <w:tblGrid>
-        <w:gridCol w:w="3312"/>
-        <w:gridCol w:w="3312"/>
-        <w:gridCol w:w="3312"/>
+        <w:gridCol w:w="2592"/>
+        <w:gridCol w:w="2592"/>
+        <w:gridCol w:w="2592"/>
+        <w:gridCol w:w="2592"/>
       </w:tblGrid>
       <w:tr>
         <w:tc>
           <w:tcPr>
-            <w:tcW w:type="dxa" w:w="720"/>
-            <w:shd w:fill="1F4E78"/>
+            <w:tcW w:type="dxa" w:w="2592"/>
+            <w:shd w:fill="EFF6FF"/>
             <w:tcMar>
-              <w:top w:w="80" w:type="dxa"/>
-              <w:bottom w:w="80" w:type="dxa"/>
-              <w:left w:w="80" w:type="dxa"/>
-              <w:right w:w="80" w:type="dxa"/>
+              <w:top w:w="140" w:type="dxa"/>
+              <w:bottom w:w="140" w:type="dxa"/>
+              <w:left w:w="100" w:type="dxa"/>
+              <w:right w:w="100" w:type="dxa"/>
             </w:tcMar>
+            <w:vAlign w:val="center"/>
           </w:tcPr>
           <w:p>
             <w:pPr>
+              <w:spacing w:before="0" w:after="40"/>
               <w:jc w:val="center"/>
             </w:pPr>
             <w:r>
               <w:rPr>
+                <w:rFonts w:ascii="Arial" w:hAnsi="Arial"/>
                 <w:b/>
-                <w:color w:val="FFFFFF"/>
-                <w:sz w:val="19"/>
+                <w:color w:val="1D4ED8"/>
+                <w:sz w:val="28"/>
               </w:rPr>
-              <w:t>#</w:t>
+              <w:t>40+</w:t>
+            </w:r>
+          </w:p>
+          <w:p>
+            <w:pPr>
+              <w:spacing w:before="0" w:after="40"/>
+              <w:jc w:val="center"/>
+            </w:pPr>
+            <w:r>
+              <w:rPr>
+                <w:rFonts w:ascii="Arial" w:hAnsi="Arial"/>
+                <w:b/>
+                <w:color w:val="1E293B"/>
+                <w:sz w:val="16"/>
+              </w:rPr>
+              <w:t>PULL REQUESTS</w:t>
+            </w:r>
+          </w:p>
+          <w:p>
+            <w:pPr>
+              <w:spacing w:before="0" w:after="0"/>
+              <w:jc w:val="center"/>
+            </w:pPr>
+            <w:r>
+              <w:rPr>
+                <w:rFonts w:ascii="Arial" w:hAnsi="Arial"/>
+                <w:color w:val="475569"/>
+                <w:sz w:val="15"/>
+              </w:rPr>
+              <w:t>Tích hợp liên tục vào develop</w:t>
             </w:r>
           </w:p>
         </w:tc>
         <w:tc>
           <w:tcPr>
-            <w:tcW w:type="dxa" w:w="3168"/>
-            <w:shd w:fill="1F4E78"/>
+            <w:tcW w:type="dxa" w:w="2592"/>
+            <w:shd w:fill="EFF6FF"/>
             <w:tcMar>
-              <w:top w:w="80" w:type="dxa"/>
-              <w:bottom w:w="80" w:type="dxa"/>
-              <w:left w:w="80" w:type="dxa"/>
-              <w:right w:w="80" w:type="dxa"/>
+              <w:top w:w="140" w:type="dxa"/>
+              <w:bottom w:w="140" w:type="dxa"/>
+              <w:left w:w="100" w:type="dxa"/>
+              <w:right w:w="100" w:type="dxa"/>
             </w:tcMar>
+            <w:vAlign w:val="center"/>
           </w:tcPr>
           <w:p>
             <w:pPr>
+              <w:spacing w:before="0" w:after="40"/>
               <w:jc w:val="center"/>
             </w:pPr>
             <w:r>
               <w:rPr>
+                <w:rFonts w:ascii="Arial" w:hAnsi="Arial"/>
                 <w:b/>
-                <w:color w:val="FFFFFF"/>
-                <w:sz w:val="19"/>
+                <w:color w:val="1D4ED8"/>
+                <w:sz w:val="28"/>
               </w:rPr>
-              <w:t>Thành phần bắt buộc</w:t>
+              <w:t>3 Apps + 2 Pkgs</w:t>
+            </w:r>
+          </w:p>
+          <w:p>
+            <w:pPr>
+              <w:spacing w:before="0" w:after="40"/>
+              <w:jc w:val="center"/>
+            </w:pPr>
+            <w:r>
+              <w:rPr>
+                <w:rFonts w:ascii="Arial" w:hAnsi="Arial"/>
+                <w:b/>
+                <w:color w:val="1E293B"/>
+                <w:sz w:val="16"/>
+              </w:rPr>
+              <w:t>MONOREPO WORKSPACE</w:t>
+            </w:r>
+          </w:p>
+          <w:p>
+            <w:pPr>
+              <w:spacing w:before="0" w:after="0"/>
+              <w:jc w:val="center"/>
+            </w:pPr>
+            <w:r>
+              <w:rPr>
+                <w:rFonts w:ascii="Arial" w:hAnsi="Arial"/>
+                <w:color w:val="475569"/>
+                <w:sz w:val="15"/>
+              </w:rPr>
+              <w:t>API Hono, Web Next, Flutter</w:t>
             </w:r>
           </w:p>
         </w:tc>
         <w:tc>
           <w:tcPr>
-            <w:tcW w:type="dxa" w:w="5616"/>
-            <w:shd w:fill="1F4E78"/>
+            <w:tcW w:type="dxa" w:w="2592"/>
+            <w:shd w:fill="EFF6FF"/>
             <w:tcMar>
-              <w:top w:w="80" w:type="dxa"/>
-              <w:bottom w:w="80" w:type="dxa"/>
-              <w:left w:w="80" w:type="dxa"/>
-              <w:right w:w="80" w:type="dxa"/>
+              <w:top w:w="140" w:type="dxa"/>
+              <w:bottom w:w="140" w:type="dxa"/>
+              <w:left w:w="100" w:type="dxa"/>
+              <w:right w:w="100" w:type="dxa"/>
+            </w:tcMar>
+            <w:vAlign w:val="center"/>
+          </w:tcPr>
+          <w:p>
+            <w:pPr>
+              <w:spacing w:before="0" w:after="40"/>
+              <w:jc w:val="center"/>
+            </w:pPr>
+            <w:r>
+              <w:rPr>
+                <w:rFonts w:ascii="Arial" w:hAnsi="Arial"/>
+                <w:b/>
+                <w:color w:val="1D4ED8"/>
+                <w:sz w:val="28"/>
+              </w:rPr>
+              <w:t>10 / 10</w:t>
+            </w:r>
+          </w:p>
+          <w:p>
+            <w:pPr>
+              <w:spacing w:before="0" w:after="40"/>
+              <w:jc w:val="center"/>
+            </w:pPr>
+            <w:r>
+              <w:rPr>
+                <w:rFonts w:ascii="Arial" w:hAnsi="Arial"/>
+                <w:b/>
+                <w:color w:val="1E293B"/>
+                <w:sz w:val="16"/>
+              </w:rPr>
+              <w:t>AI-FIRST SPECS (100%)</w:t>
+            </w:r>
+          </w:p>
+          <w:p>
+            <w:pPr>
+              <w:spacing w:before="0" w:after="0"/>
+              <w:jc w:val="center"/>
+            </w:pPr>
+            <w:r>
+              <w:rPr>
+                <w:rFonts w:ascii="Arial" w:hAnsi="Arial"/>
+                <w:color w:val="475569"/>
+                <w:sz w:val="15"/>
+              </w:rPr>
+              <w:t>Single Source of Truth hoàn chỉnh</w:t>
+            </w:r>
+          </w:p>
+        </w:tc>
+        <w:tc>
+          <w:tcPr>
+            <w:tcW w:type="dxa" w:w="2592"/>
+            <w:shd w:fill="EFF6FF"/>
+            <w:tcMar>
+              <w:top w:w="140" w:type="dxa"/>
+              <w:bottom w:w="140" w:type="dxa"/>
+              <w:left w:w="100" w:type="dxa"/>
+              <w:right w:w="100" w:type="dxa"/>
+            </w:tcMar>
+            <w:vAlign w:val="center"/>
+          </w:tcPr>
+          <w:p>
+            <w:pPr>
+              <w:spacing w:before="0" w:after="40"/>
+              <w:jc w:val="center"/>
+            </w:pPr>
+            <w:r>
+              <w:rPr>
+                <w:rFonts w:ascii="Arial" w:hAnsi="Arial"/>
+                <w:b/>
+                <w:color w:val="1D4ED8"/>
+                <w:sz w:val="28"/>
+              </w:rPr>
+              <w:t>pgvector + R2</w:t>
+            </w:r>
+          </w:p>
+          <w:p>
+            <w:pPr>
+              <w:spacing w:before="0" w:after="40"/>
+              <w:jc w:val="center"/>
+            </w:pPr>
+            <w:r>
+              <w:rPr>
+                <w:rFonts w:ascii="Arial" w:hAnsi="Arial"/>
+                <w:b/>
+                <w:color w:val="1E293B"/>
+                <w:sz w:val="16"/>
+              </w:rPr>
+              <w:t>HẠ TẦNG DỮ LIỆU &amp; AI</w:t>
+            </w:r>
+          </w:p>
+          <w:p>
+            <w:pPr>
+              <w:spacing w:before="0" w:after="0"/>
+              <w:jc w:val="center"/>
+            </w:pPr>
+            <w:r>
+              <w:rPr>
+                <w:rFonts w:ascii="Arial" w:hAnsi="Arial"/>
+                <w:color w:val="475569"/>
+                <w:sz w:val="15"/>
+              </w:rPr>
+              <w:t>Postgres 16, CLIP, Presigned URL</w:t>
+            </w:r>
+          </w:p>
+        </w:tc>
+      </w:tr>
+    </w:tbl>
+    <w:p>
+      <w:pPr>
+        <w:spacing w:before="280" w:after="80"/>
+      </w:pPr>
+      <w:r>
+        <w:rPr>
+          <w:rFonts w:ascii="Arial" w:hAnsi="Arial"/>
+          <w:b/>
+          <w:color w:val="1E3A8A"/>
+          <w:sz w:val="26"/>
+        </w:rPr>
+        <w:t>II. LỘ TRÌNH PHÁT TRIỂN &amp; CÁC MỐC THÀNH QUẢ ĐẠT ĐƯỢC</w:t>
+      </w:r>
+    </w:p>
+    <w:p>
+      <w:pPr>
+        <w:spacing w:before="0" w:after="120"/>
+      </w:pPr>
+      <w:r>
+        <w:rPr>
+          <w:rFonts w:ascii="Arial" w:hAnsi="Arial"/>
+          <w:color w:val="334155"/>
+          <w:sz w:val="20"/>
+        </w:rPr>
+        <w:t>Từ ngày khởi tạo kho mã nguồn (08/10/2026) đến thời điểm hiện tại (28/10/2026), dự án đã trải qua 4 giai đoạn phát triển trọng điểm với các kết quả cụ thể như sau:</w:t>
+      </w:r>
+    </w:p>
+    <w:tbl>
+      <w:tblPr>
+        <w:tblW w:type="auto" w:w="0"/>
+        <w:jc w:val="center"/>
+        <w:tblLayout w:type="fixed"/>
+        <w:tblLook w:firstColumn="1" w:firstRow="1" w:lastColumn="0" w:lastRow="0" w:noHBand="0" w:noVBand="1" w:val="04A0"/>
+        <w:tblBorders>
+          <w:top w:val="single" w:sz="4" w:space="0" w:color="D1D5DB"/>
+          <w:bottom w:val="single" w:sz="4" w:space="0" w:color="D1D5DB"/>
+          <w:insideH w:val="single" w:sz="4" w:space="0" w:color="D1D5DB"/>
+          <w:insideV w:val="none"/>
+          <w:left w:val="none"/>
+          <w:right w:val="none"/>
+        </w:tblBorders>
+      </w:tblPr>
+      <w:tblGrid>
+        <w:gridCol w:w="3456"/>
+        <w:gridCol w:w="3456"/>
+        <w:gridCol w:w="3456"/>
+      </w:tblGrid>
+      <w:tr>
+        <w:tc>
+          <w:tcPr>
+            <w:tcW w:type="dxa" w:w="2160"/>
+            <w:shd w:fill="1E293B"/>
+            <w:tcMar>
+              <w:top w:w="100" w:type="dxa"/>
+              <w:bottom w:w="100" w:type="dxa"/>
+              <w:left w:w="120" w:type="dxa"/>
+              <w:right w:w="120" w:type="dxa"/>
             </w:tcMar>
           </w:tcPr>
           <w:p>
             <w:pPr>
-              <w:jc w:val="center"/>
+              <w:spacing w:before="0" w:after="0"/>
             </w:pPr>
             <w:r>
               <w:rPr>
+                <w:rFonts w:ascii="Arial" w:hAnsi="Arial"/>
                 <w:b/>
                 <w:color w:val="FFFFFF"/>
                 <w:sz w:val="19"/>
               </w:rPr>
-              <w:t>Nội dung &amp; Yêu cầu kỹ thuật chi tiết</w:t>
+              <w:t>Giai đoạn &amp; Mốc</w:t>
+            </w:r>
+          </w:p>
+        </w:tc>
+        <w:tc>
+          <w:tcPr>
+            <w:tcW w:type="dxa" w:w="6480"/>
+            <w:shd w:fill="1E293B"/>
+            <w:tcMar>
+              <w:top w:w="100" w:type="dxa"/>
+              <w:bottom w:w="100" w:type="dxa"/>
+              <w:left w:w="120" w:type="dxa"/>
+              <w:right w:w="120" w:type="dxa"/>
+            </w:tcMar>
+          </w:tcPr>
+          <w:p>
+            <w:pPr>
+              <w:spacing w:before="0" w:after="0"/>
+            </w:pPr>
+            <w:r>
+              <w:rPr>
+                <w:rFonts w:ascii="Arial" w:hAnsi="Arial"/>
+                <w:b/>
+                <w:color w:val="FFFFFF"/>
+                <w:sz w:val="19"/>
+              </w:rPr>
+              <w:t>Hạng mục Kỹ thuật &amp; Thành quả Cốt lõi</w:t>
+            </w:r>
+          </w:p>
+        </w:tc>
+        <w:tc>
+          <w:tcPr>
+            <w:tcW w:type="dxa" w:w="1728"/>
+            <w:shd w:fill="1E293B"/>
+            <w:tcMar>
+              <w:top w:w="100" w:type="dxa"/>
+              <w:bottom w:w="100" w:type="dxa"/>
+              <w:left w:w="120" w:type="dxa"/>
+              <w:right w:w="120" w:type="dxa"/>
+            </w:tcMar>
+          </w:tcPr>
+          <w:p>
+            <w:pPr>
+              <w:spacing w:before="0" w:after="0"/>
+            </w:pPr>
+            <w:r>
+              <w:rPr>
+                <w:rFonts w:ascii="Arial" w:hAnsi="Arial"/>
+                <w:b/>
+                <w:color w:val="FFFFFF"/>
+                <w:sz w:val="19"/>
+              </w:rPr>
+              <w:t>Trạng thái</w:t>
             </w:r>
           </w:p>
         </w:tc>
@@ -364,25 +609,550 @@
       <w:tr>
         <w:tc>
           <w:tcPr>
-            <w:tcW w:type="dxa" w:w="720"/>
+            <w:tcW w:type="dxa" w:w="2160"/>
             <w:shd w:fill="FFFFFF"/>
             <w:tcMar>
-              <w:top w:w="60" w:type="dxa"/>
-              <w:bottom w:w="60" w:type="dxa"/>
-              <w:left w:w="80" w:type="dxa"/>
-              <w:right w:w="80" w:type="dxa"/>
+              <w:top w:w="90" w:type="dxa"/>
+              <w:bottom w:w="90" w:type="dxa"/>
+              <w:left w:w="110" w:type="dxa"/>
+              <w:right w:w="110" w:type="dxa"/>
+            </w:tcMar>
+            <w:vAlign w:val="center"/>
+          </w:tcPr>
+          <w:p>
+            <w:pPr>
+              <w:spacing w:before="0" w:after="0"/>
+            </w:pPr>
+            <w:r>
+              <w:rPr>
+                <w:rFonts w:ascii="Arial" w:hAnsi="Arial"/>
+                <w:b/>
+                <w:color w:val="1E293B"/>
+                <w:sz w:val="18"/>
+              </w:rPr>
+              <w:t>Giai đoạn 1</w:t>
+              <w:br/>
+              <w:t>(08/10 – 11/10)</w:t>
+              <w:br/>
+              <w:t>Khởi tạo &amp; Quy chuẩn</w:t>
+            </w:r>
+          </w:p>
+        </w:tc>
+        <w:tc>
+          <w:tcPr>
+            <w:tcW w:type="dxa" w:w="6480"/>
+            <w:shd w:fill="FFFFFF"/>
+            <w:tcMar>
+              <w:top w:w="90" w:type="dxa"/>
+              <w:bottom w:w="90" w:type="dxa"/>
+              <w:left w:w="110" w:type="dxa"/>
+              <w:right w:w="110" w:type="dxa"/>
+            </w:tcMar>
+            <w:vAlign w:val="center"/>
+          </w:tcPr>
+          <w:p>
+            <w:pPr>
+              <w:spacing w:before="0" w:after="0"/>
+            </w:pPr>
+            <w:r>
+              <w:rPr>
+                <w:rFonts w:ascii="Arial" w:hAnsi="Arial"/>
+                <w:color w:val="334155"/>
+                <w:sz w:val="18"/>
+              </w:rPr>
+              <w:t>• Thiết lập kiến trúc Turborepo kết hợp Bun runtime tối ưu tốc độ build.</w:t>
+              <w:br/>
+              <w:t>• Cấu hình các package dùng chung: @repo/typescript-config và @repo/eslint-config.</w:t>
+              <w:br/>
+              <w:t>• Thiết lập Git Workflow chuẩn mực: develop, feature branches, quy tắc commit và pull request.</w:t>
+            </w:r>
+          </w:p>
+        </w:tc>
+        <w:tc>
+          <w:tcPr>
+            <w:tcW w:type="dxa" w:w="1728"/>
+            <w:shd w:fill="FFFFFF"/>
+            <w:tcMar>
+              <w:top w:w="90" w:type="dxa"/>
+              <w:bottom w:w="90" w:type="dxa"/>
+              <w:left w:w="110" w:type="dxa"/>
+              <w:right w:w="110" w:type="dxa"/>
+            </w:tcMar>
+            <w:vAlign w:val="center"/>
+          </w:tcPr>
+          <w:p>
+            <w:pPr>
+              <w:spacing w:before="0" w:after="0"/>
+              <w:jc w:val="center"/>
+            </w:pPr>
+            <w:r>
+              <w:rPr>
+                <w:rFonts w:ascii="Arial" w:hAnsi="Arial"/>
+                <w:b/>
+                <w:color w:val="15803D"/>
+                <w:sz w:val="18"/>
+              </w:rPr>
+              <w:t>✅ Hoàn thành</w:t>
+            </w:r>
+          </w:p>
+        </w:tc>
+      </w:tr>
+      <w:tr>
+        <w:tc>
+          <w:tcPr>
+            <w:tcW w:type="dxa" w:w="2160"/>
+            <w:shd w:fill="F8FAFC"/>
+            <w:tcMar>
+              <w:top w:w="90" w:type="dxa"/>
+              <w:bottom w:w="90" w:type="dxa"/>
+              <w:left w:w="110" w:type="dxa"/>
+              <w:right w:w="110" w:type="dxa"/>
+            </w:tcMar>
+            <w:vAlign w:val="center"/>
+          </w:tcPr>
+          <w:p>
+            <w:pPr>
+              <w:spacing w:before="0" w:after="0"/>
+            </w:pPr>
+            <w:r>
+              <w:rPr>
+                <w:rFonts w:ascii="Arial" w:hAnsi="Arial"/>
+                <w:b/>
+                <w:color w:val="1E293B"/>
+                <w:sz w:val="18"/>
+              </w:rPr>
+              <w:t>Giai đoạn 2</w:t>
+              <w:br/>
+              <w:t>(11/10 – 16/10)</w:t>
+              <w:br/>
+              <w:t>Nền tảng Lõi, Auth &amp; RBAC</w:t>
+            </w:r>
+          </w:p>
+        </w:tc>
+        <w:tc>
+          <w:tcPr>
+            <w:tcW w:type="dxa" w:w="6480"/>
+            <w:shd w:fill="F8FAFC"/>
+            <w:tcMar>
+              <w:top w:w="90" w:type="dxa"/>
+              <w:bottom w:w="90" w:type="dxa"/>
+              <w:left w:w="110" w:type="dxa"/>
+              <w:right w:w="110" w:type="dxa"/>
+            </w:tcMar>
+            <w:vAlign w:val="center"/>
+          </w:tcPr>
+          <w:p>
+            <w:pPr>
+              <w:spacing w:before="0" w:after="0"/>
+            </w:pPr>
+            <w:r>
+              <w:rPr>
+                <w:rFonts w:ascii="Arial" w:hAnsi="Arial"/>
+                <w:color w:val="334155"/>
+                <w:sz w:val="18"/>
+              </w:rPr>
+              <w:t>• Backend (API Hono): Thiết kế phân tầng, Drizzle ORM migrations, xác thực JWT (Access/Refresh token rotation), RBAC middleware 4 vai trò, tích hợp upload ảnh Cloudflare R2.</w:t>
+              <w:br/>
+              <w:t>• Web Portal (Next.js 14): Setup layout dashboard với Shadcn/UI, màn hình Login/Register, Axios client interceptor tự refresh token, Zustand in-memory storage.</w:t>
+              <w:br/>
+              <w:t>• Mobile App (Flutter 3.x): Khởi tạo Riverpod &amp; GoRouter, Dio interceptor, Flutter Secure Storage lưu trữ an toàn token, màn hình Splash và Đăng nhập.</w:t>
+            </w:r>
+          </w:p>
+        </w:tc>
+        <w:tc>
+          <w:tcPr>
+            <w:tcW w:type="dxa" w:w="1728"/>
+            <w:shd w:fill="F8FAFC"/>
+            <w:tcMar>
+              <w:top w:w="90" w:type="dxa"/>
+              <w:bottom w:w="90" w:type="dxa"/>
+              <w:left w:w="110" w:type="dxa"/>
+              <w:right w:w="110" w:type="dxa"/>
+            </w:tcMar>
+            <w:vAlign w:val="center"/>
+          </w:tcPr>
+          <w:p>
+            <w:pPr>
+              <w:spacing w:before="0" w:after="0"/>
+              <w:jc w:val="center"/>
+            </w:pPr>
+            <w:r>
+              <w:rPr>
+                <w:rFonts w:ascii="Arial" w:hAnsi="Arial"/>
+                <w:b/>
+                <w:color w:val="15803D"/>
+                <w:sz w:val="18"/>
+              </w:rPr>
+              <w:t>✅ Hoàn thành</w:t>
+            </w:r>
+          </w:p>
+        </w:tc>
+      </w:tr>
+      <w:tr>
+        <w:tc>
+          <w:tcPr>
+            <w:tcW w:type="dxa" w:w="2160"/>
+            <w:shd w:fill="FFFFFF"/>
+            <w:tcMar>
+              <w:top w:w="90" w:type="dxa"/>
+              <w:bottom w:w="90" w:type="dxa"/>
+              <w:left w:w="110" w:type="dxa"/>
+              <w:right w:w="110" w:type="dxa"/>
+            </w:tcMar>
+            <w:vAlign w:val="center"/>
+          </w:tcPr>
+          <w:p>
+            <w:pPr>
+              <w:spacing w:before="0" w:after="0"/>
+            </w:pPr>
+            <w:r>
+              <w:rPr>
+                <w:rFonts w:ascii="Arial" w:hAnsi="Arial"/>
+                <w:b/>
+                <w:color w:val="1E293B"/>
+                <w:sz w:val="18"/>
+              </w:rPr>
+              <w:t>Giai đoạn 3</w:t>
+              <w:br/>
+              <w:t>(16/10 – 22/10)</w:t>
+              <w:br/>
+              <w:t>Nghiệp vụ Cuộc thi, Nộp bài &amp; API Specs</w:t>
+            </w:r>
+          </w:p>
+        </w:tc>
+        <w:tc>
+          <w:tcPr>
+            <w:tcW w:type="dxa" w:w="6480"/>
+            <w:shd w:fill="FFFFFF"/>
+            <w:tcMar>
+              <w:top w:w="90" w:type="dxa"/>
+              <w:bottom w:w="90" w:type="dxa"/>
+              <w:left w:w="110" w:type="dxa"/>
+              <w:right w:w="110" w:type="dxa"/>
+            </w:tcMar>
+            <w:vAlign w:val="center"/>
+          </w:tcPr>
+          <w:p>
+            <w:pPr>
+              <w:spacing w:before="0" w:after="0"/>
+            </w:pPr>
+            <w:r>
+              <w:rPr>
+                <w:rFonts w:ascii="Arial" w:hAnsi="Arial"/>
+                <w:color w:val="334155"/>
+                <w:sz w:val="18"/>
+              </w:rPr>
+              <w:t>• Backend (API): Hoàn thiện CRUD Cuộc thi (/contests), cấu hình tiêu chí (/criteria), endpoint nộp bài thi multipart (/submissions), xuất bản OpenAPI 3.0 YAML &amp; Postman Collection.</w:t>
+              <w:br/>
+              <w:t>• Web Portal: Màn hình danh sách &amp; chi tiết cuộc thi, giao diện cấu hình tiêu chí chấm thi, hệ thống Route Guards phân quyền trang portal.</w:t>
+              <w:br/>
+              <w:t>• Mobile App: Màn hình danh sách cuộc thi có lọc trạng thái, chi tiết cuộc thi kèm nút đăng ký, form nhập thông số cuộn phim và máy ảnh, image picker &amp; preview bài nộp.</w:t>
+            </w:r>
+          </w:p>
+        </w:tc>
+        <w:tc>
+          <w:tcPr>
+            <w:tcW w:type="dxa" w:w="1728"/>
+            <w:shd w:fill="FFFFFF"/>
+            <w:tcMar>
+              <w:top w:w="90" w:type="dxa"/>
+              <w:bottom w:w="90" w:type="dxa"/>
+              <w:left w:w="110" w:type="dxa"/>
+              <w:right w:w="110" w:type="dxa"/>
+            </w:tcMar>
+            <w:vAlign w:val="center"/>
+          </w:tcPr>
+          <w:p>
+            <w:pPr>
+              <w:spacing w:before="0" w:after="0"/>
+              <w:jc w:val="center"/>
+            </w:pPr>
+            <w:r>
+              <w:rPr>
+                <w:rFonts w:ascii="Arial" w:hAnsi="Arial"/>
+                <w:b/>
+                <w:color w:val="15803D"/>
+                <w:sz w:val="18"/>
+              </w:rPr>
+              <w:t>✅ Hoàn thành</w:t>
+            </w:r>
+          </w:p>
+        </w:tc>
+      </w:tr>
+      <w:tr>
+        <w:tc>
+          <w:tcPr>
+            <w:tcW w:type="dxa" w:w="2160"/>
+            <w:shd w:fill="F8FAFC"/>
+            <w:tcMar>
+              <w:top w:w="90" w:type="dxa"/>
+              <w:bottom w:w="90" w:type="dxa"/>
+              <w:left w:w="110" w:type="dxa"/>
+              <w:right w:w="110" w:type="dxa"/>
+            </w:tcMar>
+            <w:vAlign w:val="center"/>
+          </w:tcPr>
+          <w:p>
+            <w:pPr>
+              <w:spacing w:before="0" w:after="0"/>
+            </w:pPr>
+            <w:r>
+              <w:rPr>
+                <w:rFonts w:ascii="Arial" w:hAnsi="Arial"/>
+                <w:b/>
+                <w:color w:val="1E293B"/>
+                <w:sz w:val="18"/>
+              </w:rPr>
+              <w:t>Giai đoạn 4</w:t>
+              <w:br/>
+              <w:t>(22/10 – 28/10)</w:t>
+              <w:br/>
+              <w:t>Bộ Đặc tả AI-First &amp; Chuẩn hóa Hệ thống</w:t>
+            </w:r>
+          </w:p>
+        </w:tc>
+        <w:tc>
+          <w:tcPr>
+            <w:tcW w:type="dxa" w:w="6480"/>
+            <w:shd w:fill="F8FAFC"/>
+            <w:tcMar>
+              <w:top w:w="90" w:type="dxa"/>
+              <w:bottom w:w="90" w:type="dxa"/>
+              <w:left w:w="110" w:type="dxa"/>
+              <w:right w:w="110" w:type="dxa"/>
+            </w:tcMar>
+            <w:vAlign w:val="center"/>
+          </w:tcPr>
+          <w:p>
+            <w:pPr>
+              <w:spacing w:before="0" w:after="0"/>
+            </w:pPr>
+            <w:r>
+              <w:rPr>
+                <w:rFonts w:ascii="Arial" w:hAnsi="Arial"/>
+                <w:color w:val="334155"/>
+                <w:sz w:val="18"/>
+              </w:rPr>
+              <w:t>• Ban hành Quy chuẩn Đặc tả 5 phần 'AI-First Specification' làm Single Source of Truth cho lập trình viên và các AI coding assistants (Antigravity, Cursor, Copilot).</w:t>
+              <w:br/>
+              <w:t>• Hoàn thành &amp; Merge toàn bộ 10/10 Module Specs (01 đến 10) vào thư mục docs/.</w:t>
+              <w:br/>
+              <w:t>• Thiết kế hoàn chỉnh giải pháp Giám định ảnh AI (pHash DCT 64-bit + pgvector CLIP 512-dim, P_AI &gt;= 75%) và cơ chế Chấm thi ẩn danh kép (Double-Blind Judging).</w:t>
+            </w:r>
+          </w:p>
+        </w:tc>
+        <w:tc>
+          <w:tcPr>
+            <w:tcW w:type="dxa" w:w="1728"/>
+            <w:shd w:fill="F8FAFC"/>
+            <w:tcMar>
+              <w:top w:w="90" w:type="dxa"/>
+              <w:bottom w:w="90" w:type="dxa"/>
+              <w:left w:w="110" w:type="dxa"/>
+              <w:right w:w="110" w:type="dxa"/>
+            </w:tcMar>
+            <w:vAlign w:val="center"/>
+          </w:tcPr>
+          <w:p>
+            <w:pPr>
+              <w:spacing w:before="0" w:after="0"/>
+              <w:jc w:val="center"/>
+            </w:pPr>
+            <w:r>
+              <w:rPr>
+                <w:rFonts w:ascii="Arial" w:hAnsi="Arial"/>
+                <w:b/>
+                <w:color w:val="15803D"/>
+                <w:sz w:val="18"/>
+              </w:rPr>
+              <w:t>✅ Hoàn thành</w:t>
+            </w:r>
+          </w:p>
+        </w:tc>
+      </w:tr>
+    </w:tbl>
+    <w:p>
+      <w:pPr>
+        <w:spacing w:before="280" w:after="80"/>
+      </w:pPr>
+      <w:r>
+        <w:rPr>
+          <w:rFonts w:ascii="Arial" w:hAnsi="Arial"/>
+          <w:b/>
+          <w:color w:val="1E3A8A"/>
+          <w:sz w:val="26"/>
+        </w:rPr>
+        <w:t>III. MA TRẬN TRẠNG THÁI 10 MODULE ĐẶC TẢ AI-FIRST (DOCS/ SPECS)</w:t>
+      </w:r>
+    </w:p>
+    <w:p>
+      <w:pPr>
+        <w:spacing w:before="0" w:after="120"/>
+      </w:pPr>
+      <w:r>
+        <w:rPr>
+          <w:rFonts w:ascii="Arial" w:hAnsi="Arial"/>
+          <w:color w:val="334155"/>
+          <w:sz w:val="20"/>
+        </w:rPr>
+        <w:t>Toàn bộ 10 module đặc tả hệ thống đã được hợp nhất tại thư mục docs/, tuân thủ cấu trúc 5 phần bắt buộc (Domain Entities, Business Rules, State Machine, Shared API Contracts, UI/UX Flows):</w:t>
+      </w:r>
+    </w:p>
+    <w:tbl>
+      <w:tblPr>
+        <w:tblW w:type="auto" w:w="0"/>
+        <w:jc w:val="center"/>
+        <w:tblLayout w:type="fixed"/>
+        <w:tblLook w:firstColumn="1" w:firstRow="1" w:lastColumn="0" w:lastRow="0" w:noHBand="0" w:noVBand="1" w:val="04A0"/>
+        <w:tblBorders>
+          <w:top w:val="single" w:sz="4" w:space="0" w:color="D1D5DB"/>
+          <w:bottom w:val="single" w:sz="4" w:space="0" w:color="D1D5DB"/>
+          <w:insideH w:val="single" w:sz="4" w:space="0" w:color="D1D5DB"/>
+          <w:insideV w:val="none"/>
+          <w:left w:val="none"/>
+          <w:right w:val="none"/>
+        </w:tblBorders>
+      </w:tblPr>
+      <w:tblGrid>
+        <w:gridCol w:w="2592"/>
+        <w:gridCol w:w="2592"/>
+        <w:gridCol w:w="2592"/>
+        <w:gridCol w:w="2592"/>
+      </w:tblGrid>
+      <w:tr>
+        <w:tc>
+          <w:tcPr>
+            <w:tcW w:type="dxa" w:w="864"/>
+            <w:shd w:fill="1E293B"/>
+            <w:tcMar>
+              <w:top w:w="100" w:type="dxa"/>
+              <w:bottom w:w="100" w:type="dxa"/>
+              <w:left w:w="100" w:type="dxa"/>
+              <w:right w:w="100" w:type="dxa"/>
             </w:tcMar>
           </w:tcPr>
           <w:p>
             <w:pPr>
-              <w:spacing w:line="276" w:lineRule="auto" w:after="40"/>
+              <w:spacing w:before="0" w:after="0"/>
               <w:jc w:val="center"/>
             </w:pPr>
             <w:r>
               <w:rPr>
+                <w:rFonts w:ascii="Arial" w:hAnsi="Arial"/>
                 <w:b/>
+                <w:color w:val="FFFFFF"/>
+                <w:sz w:val="19"/>
               </w:rPr>
-              <w:t>1</w:t>
+              <w:t>STT</w:t>
+            </w:r>
+          </w:p>
+        </w:tc>
+        <w:tc>
+          <w:tcPr>
+            <w:tcW w:type="dxa" w:w="3168"/>
+            <w:shd w:fill="1E293B"/>
+            <w:tcMar>
+              <w:top w:w="100" w:type="dxa"/>
+              <w:bottom w:w="100" w:type="dxa"/>
+              <w:left w:w="100" w:type="dxa"/>
+              <w:right w:w="100" w:type="dxa"/>
+            </w:tcMar>
+          </w:tcPr>
+          <w:p>
+            <w:pPr>
+              <w:spacing w:before="0" w:after="0"/>
+            </w:pPr>
+            <w:r>
+              <w:rPr>
+                <w:rFonts w:ascii="Arial" w:hAnsi="Arial"/>
+                <w:b/>
+                <w:color w:val="FFFFFF"/>
+                <w:sz w:val="19"/>
+              </w:rPr>
+              <w:t>Module &amp; Tệp Đặc Tả</w:t>
+            </w:r>
+          </w:p>
+        </w:tc>
+        <w:tc>
+          <w:tcPr>
+            <w:tcW w:type="dxa" w:w="4752"/>
+            <w:shd w:fill="1E293B"/>
+            <w:tcMar>
+              <w:top w:w="100" w:type="dxa"/>
+              <w:bottom w:w="100" w:type="dxa"/>
+              <w:left w:w="100" w:type="dxa"/>
+              <w:right w:w="100" w:type="dxa"/>
+            </w:tcMar>
+          </w:tcPr>
+          <w:p>
+            <w:pPr>
+              <w:spacing w:before="0" w:after="0"/>
+            </w:pPr>
+            <w:r>
+              <w:rPr>
+                <w:rFonts w:ascii="Arial" w:hAnsi="Arial"/>
+                <w:b/>
+                <w:color w:val="FFFFFF"/>
+                <w:sz w:val="19"/>
+              </w:rPr>
+              <w:t>Nghiệp vụ Trọng tâm &amp; Thiết kế Kỹ thuật</w:t>
+            </w:r>
+          </w:p>
+        </w:tc>
+        <w:tc>
+          <w:tcPr>
+            <w:tcW w:type="dxa" w:w="1584"/>
+            <w:shd w:fill="1E293B"/>
+            <w:tcMar>
+              <w:top w:w="100" w:type="dxa"/>
+              <w:bottom w:w="100" w:type="dxa"/>
+              <w:left w:w="100" w:type="dxa"/>
+              <w:right w:w="100" w:type="dxa"/>
+            </w:tcMar>
+          </w:tcPr>
+          <w:p>
+            <w:pPr>
+              <w:spacing w:before="0" w:after="0"/>
+              <w:jc w:val="center"/>
+            </w:pPr>
+            <w:r>
+              <w:rPr>
+                <w:rFonts w:ascii="Arial" w:hAnsi="Arial"/>
+                <w:b/>
+                <w:color w:val="FFFFFF"/>
+                <w:sz w:val="19"/>
+              </w:rPr>
+              <w:t>Trạng thái</w:t>
+            </w:r>
+          </w:p>
+        </w:tc>
+      </w:tr>
+      <w:tr>
+        <w:tc>
+          <w:tcPr>
+            <w:tcW w:type="dxa" w:w="864"/>
+            <w:shd w:fill="FFFFFF"/>
+            <w:tcMar>
+              <w:top w:w="80" w:type="dxa"/>
+              <w:bottom w:w="80" w:type="dxa"/>
+              <w:left w:w="90" w:type="dxa"/>
+              <w:right w:w="90" w:type="dxa"/>
+            </w:tcMar>
+            <w:vAlign w:val="center"/>
+          </w:tcPr>
+          <w:p>
+            <w:pPr>
+              <w:spacing w:before="0" w:after="0"/>
+              <w:jc w:val="center"/>
+            </w:pPr>
+            <w:r>
+              <w:rPr>
+                <w:rFonts w:ascii="Arial" w:hAnsi="Arial"/>
+                <w:b/>
+                <w:color w:val="1E293B"/>
+                <w:sz w:val="17"/>
+              </w:rPr>
+              <w:t>01</w:t>
             </w:r>
           </w:p>
         </w:tc>
@@ -391,41 +1161,79 @@
             <w:tcW w:type="dxa" w:w="3168"/>
             <w:shd w:fill="FFFFFF"/>
             <w:tcMar>
-              <w:top w:w="60" w:type="dxa"/>
-              <w:bottom w:w="60" w:type="dxa"/>
-              <w:left w:w="80" w:type="dxa"/>
-              <w:right w:w="80" w:type="dxa"/>
+              <w:top w:w="80" w:type="dxa"/>
+              <w:bottom w:w="80" w:type="dxa"/>
+              <w:left w:w="90" w:type="dxa"/>
+              <w:right w:w="90" w:type="dxa"/>
             </w:tcMar>
+            <w:vAlign w:val="center"/>
           </w:tcPr>
           <w:p>
             <w:pPr>
-              <w:spacing w:line="276" w:lineRule="auto" w:after="40"/>
+              <w:spacing w:before="0" w:after="0"/>
             </w:pPr>
             <w:r>
               <w:rPr>
+                <w:rFonts w:ascii="Arial" w:hAnsi="Arial"/>
                 <w:b/>
+                <w:color w:val="0284C7"/>
+                <w:sz w:val="17"/>
               </w:rPr>
-              <w:t>Domain Entities &amp; Database Mapping</w:t>
+              <w:t>01-auth-and-rbac.md</w:t>
             </w:r>
           </w:p>
         </w:tc>
         <w:tc>
           <w:tcPr>
-            <w:tcW w:type="dxa" w:w="5616"/>
+            <w:tcW w:type="dxa" w:w="4752"/>
             <w:shd w:fill="FFFFFF"/>
             <w:tcMar>
-              <w:top w:w="60" w:type="dxa"/>
-              <w:bottom w:w="60" w:type="dxa"/>
-              <w:left w:w="80" w:type="dxa"/>
-              <w:right w:w="80" w:type="dxa"/>
+              <w:top w:w="80" w:type="dxa"/>
+              <w:bottom w:w="80" w:type="dxa"/>
+              <w:left w:w="90" w:type="dxa"/>
+              <w:right w:w="90" w:type="dxa"/>
             </w:tcMar>
+            <w:vAlign w:val="center"/>
           </w:tcPr>
           <w:p>
             <w:pPr>
-              <w:spacing w:line="276" w:lineRule="auto" w:after="40"/>
+              <w:spacing w:before="0" w:after="0"/>
             </w:pPr>
             <w:r>
-              <w:t>Đặc tả chi tiết toàn bộ bảng cơ sở dữ liệu (PostgreSQL/Drizzle ORM): Tên trường theo snake_case, kiểu dữ liệu, ràng buộc (PK, FK, Unique, Check), giá trị mặc định, chỉ mục (B-Tree, HNSW vector), biểu đồ quan hệ Mermaid ERD.</w:t>
+              <w:rPr>
+                <w:rFonts w:ascii="Arial" w:hAnsi="Arial"/>
+                <w:color w:val="334155"/>
+                <w:sz w:val="17"/>
+              </w:rPr>
+              <w:t>Xác thực JWT, Token Rotation, phân quyền RBAC Matrix 4 vai trò, Audit Log, Zod Schemas đầy đủ.</w:t>
+            </w:r>
+          </w:p>
+        </w:tc>
+        <w:tc>
+          <w:tcPr>
+            <w:tcW w:type="dxa" w:w="1584"/>
+            <w:shd w:fill="FFFFFF"/>
+            <w:tcMar>
+              <w:top w:w="80" w:type="dxa"/>
+              <w:bottom w:w="80" w:type="dxa"/>
+              <w:left w:w="90" w:type="dxa"/>
+              <w:right w:w="90" w:type="dxa"/>
+            </w:tcMar>
+            <w:vAlign w:val="center"/>
+          </w:tcPr>
+          <w:p>
+            <w:pPr>
+              <w:spacing w:before="0" w:after="0"/>
+              <w:jc w:val="center"/>
+            </w:pPr>
+            <w:r>
+              <w:rPr>
+                <w:rFonts w:ascii="Arial" w:hAnsi="Arial"/>
+                <w:b/>
+                <w:color w:val="15803D"/>
+                <w:sz w:val="17"/>
+              </w:rPr>
+              <w:t>✅ Hoàn thành</w:t>
             </w:r>
           </w:p>
         </w:tc>
@@ -433,68 +1241,110 @@
       <w:tr>
         <w:tc>
           <w:tcPr>
-            <w:tcW w:type="dxa" w:w="720"/>
-            <w:shd w:fill="F9FAFC"/>
+            <w:tcW w:type="dxa" w:w="864"/>
+            <w:shd w:fill="F8FAFC"/>
             <w:tcMar>
-              <w:top w:w="60" w:type="dxa"/>
-              <w:bottom w:w="60" w:type="dxa"/>
-              <w:left w:w="80" w:type="dxa"/>
-              <w:right w:w="80" w:type="dxa"/>
+              <w:top w:w="80" w:type="dxa"/>
+              <w:bottom w:w="80" w:type="dxa"/>
+              <w:left w:w="90" w:type="dxa"/>
+              <w:right w:w="90" w:type="dxa"/>
             </w:tcMar>
+            <w:vAlign w:val="center"/>
           </w:tcPr>
           <w:p>
             <w:pPr>
-              <w:spacing w:line="276" w:lineRule="auto" w:after="40"/>
+              <w:spacing w:before="0" w:after="0"/>
               <w:jc w:val="center"/>
             </w:pPr>
             <w:r>
               <w:rPr>
+                <w:rFonts w:ascii="Arial" w:hAnsi="Arial"/>
                 <w:b/>
+                <w:color w:val="1E293B"/>
+                <w:sz w:val="17"/>
               </w:rPr>
-              <w:t>2</w:t>
+              <w:t>02</w:t>
             </w:r>
           </w:p>
         </w:tc>
         <w:tc>
           <w:tcPr>
             <w:tcW w:type="dxa" w:w="3168"/>
-            <w:shd w:fill="F9FAFC"/>
+            <w:shd w:fill="F8FAFC"/>
             <w:tcMar>
-              <w:top w:w="60" w:type="dxa"/>
-              <w:bottom w:w="60" w:type="dxa"/>
-              <w:left w:w="80" w:type="dxa"/>
-              <w:right w:w="80" w:type="dxa"/>
+              <w:top w:w="80" w:type="dxa"/>
+              <w:bottom w:w="80" w:type="dxa"/>
+              <w:left w:w="90" w:type="dxa"/>
+              <w:right w:w="90" w:type="dxa"/>
             </w:tcMar>
+            <w:vAlign w:val="center"/>
           </w:tcPr>
           <w:p>
             <w:pPr>
-              <w:spacing w:line="276" w:lineRule="auto" w:after="40"/>
+              <w:spacing w:before="0" w:after="0"/>
             </w:pPr>
             <w:r>
               <w:rPr>
+                <w:rFonts w:ascii="Arial" w:hAnsi="Arial"/>
                 <w:b/>
+                <w:color w:val="0284C7"/>
+                <w:sz w:val="17"/>
               </w:rPr>
-              <w:t>Business Rules &amp; Deterministic Logic</w:t>
+              <w:t>02-analog-master-data.md</w:t>
             </w:r>
           </w:p>
         </w:tc>
         <w:tc>
           <w:tcPr>
-            <w:tcW w:type="dxa" w:w="5616"/>
-            <w:shd w:fill="F9FAFC"/>
+            <w:tcW w:type="dxa" w:w="4752"/>
+            <w:shd w:fill="F8FAFC"/>
             <w:tcMar>
-              <w:top w:w="60" w:type="dxa"/>
-              <w:bottom w:w="60" w:type="dxa"/>
-              <w:left w:w="80" w:type="dxa"/>
-              <w:right w:w="80" w:type="dxa"/>
+              <w:top w:w="80" w:type="dxa"/>
+              <w:bottom w:w="80" w:type="dxa"/>
+              <w:left w:w="90" w:type="dxa"/>
+              <w:right w:w="90" w:type="dxa"/>
             </w:tcMar>
+            <w:vAlign w:val="center"/>
           </w:tcPr>
           <w:p>
             <w:pPr>
-              <w:spacing w:line="276" w:lineRule="auto" w:after="40"/>
+              <w:spacing w:before="0" w:after="0"/>
             </w:pPr>
             <w:r>
-              <w:t>Trích xuất và ánh xạ tường minh các quy tắc nghiệp vụ từ SRS (BR-01 đến BR-25). Viết rõ điều kiện logic rẽ nhánh, công thức toán học và schema xác thực dữ liệu đầu vào (Zod validation schemas).</w:t>
+              <w:rPr>
+                <w:rFonts w:ascii="Arial" w:hAnsi="Arial"/>
+                <w:color w:val="334155"/>
+                <w:sz w:val="17"/>
+              </w:rPr>
+              <w:t>Master Data: Film Stock, Camera, Lens, Film Lab, Mermaid ERD, Seed Data mẫu, Zod Schemas.</w:t>
+            </w:r>
+          </w:p>
+        </w:tc>
+        <w:tc>
+          <w:tcPr>
+            <w:tcW w:type="dxa" w:w="1584"/>
+            <w:shd w:fill="F8FAFC"/>
+            <w:tcMar>
+              <w:top w:w="80" w:type="dxa"/>
+              <w:bottom w:w="80" w:type="dxa"/>
+              <w:left w:w="90" w:type="dxa"/>
+              <w:right w:w="90" w:type="dxa"/>
+            </w:tcMar>
+            <w:vAlign w:val="center"/>
+          </w:tcPr>
+          <w:p>
+            <w:pPr>
+              <w:spacing w:before="0" w:after="0"/>
+              <w:jc w:val="center"/>
+            </w:pPr>
+            <w:r>
+              <w:rPr>
+                <w:rFonts w:ascii="Arial" w:hAnsi="Arial"/>
+                <w:b/>
+                <w:color w:val="15803D"/>
+                <w:sz w:val="17"/>
+              </w:rPr>
+              <w:t>✅ Hoàn thành</w:t>
             </w:r>
           </w:p>
         </w:tc>
@@ -502,25 +1352,29 @@
       <w:tr>
         <w:tc>
           <w:tcPr>
-            <w:tcW w:type="dxa" w:w="720"/>
+            <w:tcW w:type="dxa" w:w="864"/>
             <w:shd w:fill="FFFFFF"/>
             <w:tcMar>
-              <w:top w:w="60" w:type="dxa"/>
-              <w:bottom w:w="60" w:type="dxa"/>
-              <w:left w:w="80" w:type="dxa"/>
-              <w:right w:w="80" w:type="dxa"/>
+              <w:top w:w="80" w:type="dxa"/>
+              <w:bottom w:w="80" w:type="dxa"/>
+              <w:left w:w="90" w:type="dxa"/>
+              <w:right w:w="90" w:type="dxa"/>
             </w:tcMar>
+            <w:vAlign w:val="center"/>
           </w:tcPr>
           <w:p>
             <w:pPr>
-              <w:spacing w:line="276" w:lineRule="auto" w:after="40"/>
+              <w:spacing w:before="0" w:after="0"/>
               <w:jc w:val="center"/>
             </w:pPr>
             <w:r>
               <w:rPr>
+                <w:rFonts w:ascii="Arial" w:hAnsi="Arial"/>
                 <w:b/>
+                <w:color w:val="1E293B"/>
+                <w:sz w:val="17"/>
               </w:rPr>
-              <w:t>3</w:t>
+              <w:t>03</w:t>
             </w:r>
           </w:p>
         </w:tc>
@@ -529,41 +1383,79 @@
             <w:tcW w:type="dxa" w:w="3168"/>
             <w:shd w:fill="FFFFFF"/>
             <w:tcMar>
-              <w:top w:w="60" w:type="dxa"/>
-              <w:bottom w:w="60" w:type="dxa"/>
-              <w:left w:w="80" w:type="dxa"/>
-              <w:right w:w="80" w:type="dxa"/>
+              <w:top w:w="80" w:type="dxa"/>
+              <w:bottom w:w="80" w:type="dxa"/>
+              <w:left w:w="90" w:type="dxa"/>
+              <w:right w:w="90" w:type="dxa"/>
             </w:tcMar>
+            <w:vAlign w:val="center"/>
           </w:tcPr>
           <w:p>
             <w:pPr>
-              <w:spacing w:line="276" w:lineRule="auto" w:after="40"/>
+              <w:spacing w:before="0" w:after="0"/>
             </w:pPr>
             <w:r>
               <w:rPr>
+                <w:rFonts w:ascii="Arial" w:hAnsi="Arial"/>
                 <w:b/>
+                <w:color w:val="0284C7"/>
+                <w:sz w:val="17"/>
               </w:rPr>
-              <w:t>State Machine &amp; Lifecycle</w:t>
+              <w:t>03-contest-lifecycle.md</w:t>
             </w:r>
           </w:p>
         </w:tc>
         <w:tc>
           <w:tcPr>
-            <w:tcW w:type="dxa" w:w="5616"/>
+            <w:tcW w:type="dxa" w:w="4752"/>
             <w:shd w:fill="FFFFFF"/>
             <w:tcMar>
-              <w:top w:w="60" w:type="dxa"/>
-              <w:bottom w:w="60" w:type="dxa"/>
-              <w:left w:w="80" w:type="dxa"/>
-              <w:right w:w="80" w:type="dxa"/>
+              <w:top w:w="80" w:type="dxa"/>
+              <w:bottom w:w="80" w:type="dxa"/>
+              <w:left w:w="90" w:type="dxa"/>
+              <w:right w:w="90" w:type="dxa"/>
             </w:tcMar>
+            <w:vAlign w:val="center"/>
           </w:tcPr>
           <w:p>
             <w:pPr>
-              <w:spacing w:line="276" w:lineRule="auto" w:after="40"/>
+              <w:spacing w:before="0" w:after="0"/>
             </w:pPr>
             <w:r>
-              <w:t>Vẽ sơ đồ chuyển đổi trạng thái bằng Mermaid State Diagram. Lập bảng State Transition Table chi tiết gồm: Trạng thái hiện tại, Sự kiện kích hoạt (Event), Tác nhân (Actor), Điều kiện chặn (Guard Condition), Trạng thái đích.</w:t>
+              <w:rPr>
+                <w:rFonts w:ascii="Arial" w:hAnsi="Arial"/>
+                <w:color w:val="334155"/>
+                <w:sz w:val="17"/>
+              </w:rPr>
+              <w:t>Vòng đời cuộc thi, cấu hình mốc thời gian BR-08, thiết lập ngưỡng AI kiểm duyệt (P_AI, pHash).</w:t>
+            </w:r>
+          </w:p>
+        </w:tc>
+        <w:tc>
+          <w:tcPr>
+            <w:tcW w:type="dxa" w:w="1584"/>
+            <w:shd w:fill="FFFFFF"/>
+            <w:tcMar>
+              <w:top w:w="80" w:type="dxa"/>
+              <w:bottom w:w="80" w:type="dxa"/>
+              <w:left w:w="90" w:type="dxa"/>
+              <w:right w:w="90" w:type="dxa"/>
+            </w:tcMar>
+            <w:vAlign w:val="center"/>
+          </w:tcPr>
+          <w:p>
+            <w:pPr>
+              <w:spacing w:before="0" w:after="0"/>
+              <w:jc w:val="center"/>
+            </w:pPr>
+            <w:r>
+              <w:rPr>
+                <w:rFonts w:ascii="Arial" w:hAnsi="Arial"/>
+                <w:b/>
+                <w:color w:val="15803D"/>
+                <w:sz w:val="17"/>
+              </w:rPr>
+              <w:t>✅ Đã merge</w:t>
             </w:r>
           </w:p>
         </w:tc>
@@ -571,68 +1463,110 @@
       <w:tr>
         <w:tc>
           <w:tcPr>
-            <w:tcW w:type="dxa" w:w="720"/>
-            <w:shd w:fill="F9FAFC"/>
+            <w:tcW w:type="dxa" w:w="864"/>
+            <w:shd w:fill="F8FAFC"/>
             <w:tcMar>
-              <w:top w:w="60" w:type="dxa"/>
-              <w:bottom w:w="60" w:type="dxa"/>
-              <w:left w:w="80" w:type="dxa"/>
-              <w:right w:w="80" w:type="dxa"/>
+              <w:top w:w="80" w:type="dxa"/>
+              <w:bottom w:w="80" w:type="dxa"/>
+              <w:left w:w="90" w:type="dxa"/>
+              <w:right w:w="90" w:type="dxa"/>
             </w:tcMar>
+            <w:vAlign w:val="center"/>
           </w:tcPr>
           <w:p>
             <w:pPr>
-              <w:spacing w:line="276" w:lineRule="auto" w:after="40"/>
+              <w:spacing w:before="0" w:after="0"/>
               <w:jc w:val="center"/>
             </w:pPr>
             <w:r>
               <w:rPr>
+                <w:rFonts w:ascii="Arial" w:hAnsi="Arial"/>
                 <w:b/>
+                <w:color w:val="1E293B"/>
+                <w:sz w:val="17"/>
               </w:rPr>
-              <w:t>4</w:t>
+              <w:t>04</w:t>
             </w:r>
           </w:p>
         </w:tc>
         <w:tc>
           <w:tcPr>
             <w:tcW w:type="dxa" w:w="3168"/>
-            <w:shd w:fill="F9FAFC"/>
+            <w:shd w:fill="F8FAFC"/>
             <w:tcMar>
-              <w:top w:w="60" w:type="dxa"/>
-              <w:bottom w:w="60" w:type="dxa"/>
-              <w:left w:w="80" w:type="dxa"/>
-              <w:right w:w="80" w:type="dxa"/>
+              <w:top w:w="80" w:type="dxa"/>
+              <w:bottom w:w="80" w:type="dxa"/>
+              <w:left w:w="90" w:type="dxa"/>
+              <w:right w:w="90" w:type="dxa"/>
             </w:tcMar>
+            <w:vAlign w:val="center"/>
           </w:tcPr>
           <w:p>
             <w:pPr>
-              <w:spacing w:line="276" w:lineRule="auto" w:after="40"/>
+              <w:spacing w:before="0" w:after="0"/>
             </w:pPr>
             <w:r>
               <w:rPr>
+                <w:rFonts w:ascii="Arial" w:hAnsi="Arial"/>
                 <w:b/>
+                <w:color w:val="0284C7"/>
+                <w:sz w:val="17"/>
               </w:rPr>
-              <w:t>Shared API Contracts</w:t>
+              <w:t>04-film-logbook.md</w:t>
             </w:r>
           </w:p>
         </w:tc>
         <w:tc>
           <w:tcPr>
-            <w:tcW w:type="dxa" w:w="5616"/>
-            <w:shd w:fill="F9FAFC"/>
+            <w:tcW w:type="dxa" w:w="4752"/>
+            <w:shd w:fill="F8FAFC"/>
             <w:tcMar>
-              <w:top w:w="60" w:type="dxa"/>
-              <w:bottom w:w="60" w:type="dxa"/>
-              <w:left w:w="80" w:type="dxa"/>
-              <w:right w:w="80" w:type="dxa"/>
+              <w:top w:w="80" w:type="dxa"/>
+              <w:bottom w:w="80" w:type="dxa"/>
+              <w:left w:w="90" w:type="dxa"/>
+              <w:right w:w="90" w:type="dxa"/>
             </w:tcMar>
+            <w:vAlign w:val="center"/>
           </w:tcPr>
           <w:p>
             <w:pPr>
-              <w:spacing w:line="276" w:lineRule="auto" w:after="40"/>
+              <w:spacing w:before="0" w:after="0"/>
             </w:pPr>
             <w:r>
-              <w:t>Định nghĩa RESTful endpoint chuẩn: Method, URL path, Headers, Request Body Zod schema, chuẩn hóa Response Envelope dạng { success, data, error, meta }, mã lỗi nghiệp vụ chuẩn hóa (MSG-xxx) và HTTP status codes.</w:t>
+              <w:rPr>
+                <w:rFonts w:ascii="Arial" w:hAnsi="Arial"/>
+                <w:color w:val="334155"/>
+                <w:sz w:val="17"/>
+              </w:rPr>
+              <w:t>Quản lý nhật ký cuộn phim (film_rolls) và từng khung hình chụp (film_frames) theo BR-03, BR-23.</w:t>
+            </w:r>
+          </w:p>
+        </w:tc>
+        <w:tc>
+          <w:tcPr>
+            <w:tcW w:type="dxa" w:w="1584"/>
+            <w:shd w:fill="F8FAFC"/>
+            <w:tcMar>
+              <w:top w:w="80" w:type="dxa"/>
+              <w:bottom w:w="80" w:type="dxa"/>
+              <w:left w:w="90" w:type="dxa"/>
+              <w:right w:w="90" w:type="dxa"/>
+            </w:tcMar>
+            <w:vAlign w:val="center"/>
+          </w:tcPr>
+          <w:p>
+            <w:pPr>
+              <w:spacing w:before="0" w:after="0"/>
+              <w:jc w:val="center"/>
+            </w:pPr>
+            <w:r>
+              <w:rPr>
+                <w:rFonts w:ascii="Arial" w:hAnsi="Arial"/>
+                <w:b/>
+                <w:color w:val="15803D"/>
+                <w:sz w:val="17"/>
+              </w:rPr>
+              <w:t>✅ Đã merge</w:t>
             </w:r>
           </w:p>
         </w:tc>
@@ -640,25 +1574,29 @@
       <w:tr>
         <w:tc>
           <w:tcPr>
-            <w:tcW w:type="dxa" w:w="720"/>
+            <w:tcW w:type="dxa" w:w="864"/>
             <w:shd w:fill="FFFFFF"/>
             <w:tcMar>
-              <w:top w:w="60" w:type="dxa"/>
-              <w:bottom w:w="60" w:type="dxa"/>
-              <w:left w:w="80" w:type="dxa"/>
-              <w:right w:w="80" w:type="dxa"/>
+              <w:top w:w="80" w:type="dxa"/>
+              <w:bottom w:w="80" w:type="dxa"/>
+              <w:left w:w="90" w:type="dxa"/>
+              <w:right w:w="90" w:type="dxa"/>
             </w:tcMar>
+            <w:vAlign w:val="center"/>
           </w:tcPr>
           <w:p>
             <w:pPr>
-              <w:spacing w:line="276" w:lineRule="auto" w:after="40"/>
+              <w:spacing w:before="0" w:after="0"/>
               <w:jc w:val="center"/>
             </w:pPr>
             <w:r>
               <w:rPr>
+                <w:rFonts w:ascii="Arial" w:hAnsi="Arial"/>
                 <w:b/>
+                <w:color w:val="1E293B"/>
+                <w:sz w:val="17"/>
               </w:rPr>
-              <w:t>5</w:t>
+              <w:t>05</w:t>
             </w:r>
           </w:p>
         </w:tc>
@@ -667,41 +1605,634 @@
             <w:tcW w:type="dxa" w:w="3168"/>
             <w:shd w:fill="FFFFFF"/>
             <w:tcMar>
-              <w:top w:w="60" w:type="dxa"/>
-              <w:bottom w:w="60" w:type="dxa"/>
-              <w:left w:w="80" w:type="dxa"/>
-              <w:right w:w="80" w:type="dxa"/>
+              <w:top w:w="80" w:type="dxa"/>
+              <w:bottom w:w="80" w:type="dxa"/>
+              <w:left w:w="90" w:type="dxa"/>
+              <w:right w:w="90" w:type="dxa"/>
             </w:tcMar>
+            <w:vAlign w:val="center"/>
           </w:tcPr>
           <w:p>
             <w:pPr>
-              <w:spacing w:line="276" w:lineRule="auto" w:after="40"/>
+              <w:spacing w:before="0" w:after="0"/>
             </w:pPr>
             <w:r>
               <w:rPr>
+                <w:rFonts w:ascii="Arial" w:hAnsi="Arial"/>
                 <w:b/>
+                <w:color w:val="0284C7"/>
+                <w:sz w:val="17"/>
               </w:rPr>
-              <w:t>UI/UX Functional Requirements</w:t>
+              <w:t>05-submission-and-proof.md</w:t>
             </w:r>
           </w:p>
         </w:tc>
         <w:tc>
           <w:tcPr>
-            <w:tcW w:type="dxa" w:w="5616"/>
+            <w:tcW w:type="dxa" w:w="4752"/>
             <w:shd w:fill="FFFFFF"/>
             <w:tcMar>
-              <w:top w:w="60" w:type="dxa"/>
-              <w:bottom w:w="60" w:type="dxa"/>
-              <w:left w:w="80" w:type="dxa"/>
-              <w:right w:w="80" w:type="dxa"/>
+              <w:top w:w="80" w:type="dxa"/>
+              <w:bottom w:w="80" w:type="dxa"/>
+              <w:left w:w="90" w:type="dxa"/>
+              <w:right w:w="90" w:type="dxa"/>
             </w:tcMar>
+            <w:vAlign w:val="center"/>
           </w:tcPr>
           <w:p>
             <w:pPr>
-              <w:spacing w:line="276" w:lineRule="auto" w:after="40"/>
+              <w:spacing w:before="0" w:after="0"/>
             </w:pPr>
             <w:r>
-              <w:t>Mô tả luồng người dùng (User Journey flows) trên cả Web và Mobile Flutter. Đặc tả 4 trạng thái giao diện bắt buộc: Default (bình thường), Loading (tải), Empty (rỗng), Error (báo lỗi) và cơ chế xử lý khi mất kết nối mạng.</w:t>
+              <w:rPr>
+                <w:rFonts w:ascii="Arial" w:hAnsi="Arial"/>
+                <w:color w:val="334155"/>
+                <w:sz w:val="17"/>
+              </w:rPr>
+              <w:t>Luồng nộp bài thi, cơ chế nộp ảnh âm bản đối chứng trong 48 giờ theo BR-06, BR-19.</w:t>
+            </w:r>
+          </w:p>
+        </w:tc>
+        <w:tc>
+          <w:tcPr>
+            <w:tcW w:type="dxa" w:w="1584"/>
+            <w:shd w:fill="FFFFFF"/>
+            <w:tcMar>
+              <w:top w:w="80" w:type="dxa"/>
+              <w:bottom w:w="80" w:type="dxa"/>
+              <w:left w:w="90" w:type="dxa"/>
+              <w:right w:w="90" w:type="dxa"/>
+            </w:tcMar>
+            <w:vAlign w:val="center"/>
+          </w:tcPr>
+          <w:p>
+            <w:pPr>
+              <w:spacing w:before="0" w:after="0"/>
+              <w:jc w:val="center"/>
+            </w:pPr>
+            <w:r>
+              <w:rPr>
+                <w:rFonts w:ascii="Arial" w:hAnsi="Arial"/>
+                <w:b/>
+                <w:color w:val="15803D"/>
+                <w:sz w:val="17"/>
+              </w:rPr>
+              <w:t>✅ Đã merge</w:t>
+            </w:r>
+          </w:p>
+        </w:tc>
+      </w:tr>
+      <w:tr>
+        <w:tc>
+          <w:tcPr>
+            <w:tcW w:type="dxa" w:w="864"/>
+            <w:shd w:fill="F8FAFC"/>
+            <w:tcMar>
+              <w:top w:w="80" w:type="dxa"/>
+              <w:bottom w:w="80" w:type="dxa"/>
+              <w:left w:w="90" w:type="dxa"/>
+              <w:right w:w="90" w:type="dxa"/>
+            </w:tcMar>
+            <w:vAlign w:val="center"/>
+          </w:tcPr>
+          <w:p>
+            <w:pPr>
+              <w:spacing w:before="0" w:after="0"/>
+              <w:jc w:val="center"/>
+            </w:pPr>
+            <w:r>
+              <w:rPr>
+                <w:rFonts w:ascii="Arial" w:hAnsi="Arial"/>
+                <w:b/>
+                <w:color w:val="1E293B"/>
+                <w:sz w:val="17"/>
+              </w:rPr>
+              <w:t>06</w:t>
+            </w:r>
+          </w:p>
+        </w:tc>
+        <w:tc>
+          <w:tcPr>
+            <w:tcW w:type="dxa" w:w="3168"/>
+            <w:shd w:fill="F8FAFC"/>
+            <w:tcMar>
+              <w:top w:w="80" w:type="dxa"/>
+              <w:bottom w:w="80" w:type="dxa"/>
+              <w:left w:w="90" w:type="dxa"/>
+              <w:right w:w="90" w:type="dxa"/>
+            </w:tcMar>
+            <w:vAlign w:val="center"/>
+          </w:tcPr>
+          <w:p>
+            <w:pPr>
+              <w:spacing w:before="0" w:after="0"/>
+            </w:pPr>
+            <w:r>
+              <w:rPr>
+                <w:rFonts w:ascii="Arial" w:hAnsi="Arial"/>
+                <w:b/>
+                <w:color w:val="0284C7"/>
+                <w:sz w:val="17"/>
+              </w:rPr>
+              <w:t>06-ai-verification.md</w:t>
+            </w:r>
+          </w:p>
+        </w:tc>
+        <w:tc>
+          <w:tcPr>
+            <w:tcW w:type="dxa" w:w="4752"/>
+            <w:shd w:fill="F8FAFC"/>
+            <w:tcMar>
+              <w:top w:w="80" w:type="dxa"/>
+              <w:bottom w:w="80" w:type="dxa"/>
+              <w:left w:w="90" w:type="dxa"/>
+              <w:right w:w="90" w:type="dxa"/>
+            </w:tcMar>
+            <w:vAlign w:val="center"/>
+          </w:tcPr>
+          <w:p>
+            <w:pPr>
+              <w:spacing w:before="0" w:after="0"/>
+            </w:pPr>
+            <w:r>
+              <w:rPr>
+                <w:rFonts w:ascii="Arial" w:hAnsi="Arial"/>
+                <w:color w:val="334155"/>
+                <w:sz w:val="17"/>
+              </w:rPr>
+              <w:t>Giám định ảnh AI (P_AI &gt;= 75%), pHash DCT 64-bit, pgvector CLIP 512-dim, Redis BullMQ Worker.</w:t>
+            </w:r>
+          </w:p>
+        </w:tc>
+        <w:tc>
+          <w:tcPr>
+            <w:tcW w:type="dxa" w:w="1584"/>
+            <w:shd w:fill="F8FAFC"/>
+            <w:tcMar>
+              <w:top w:w="80" w:type="dxa"/>
+              <w:bottom w:w="80" w:type="dxa"/>
+              <w:left w:w="90" w:type="dxa"/>
+              <w:right w:w="90" w:type="dxa"/>
+            </w:tcMar>
+            <w:vAlign w:val="center"/>
+          </w:tcPr>
+          <w:p>
+            <w:pPr>
+              <w:spacing w:before="0" w:after="0"/>
+              <w:jc w:val="center"/>
+            </w:pPr>
+            <w:r>
+              <w:rPr>
+                <w:rFonts w:ascii="Arial" w:hAnsi="Arial"/>
+                <w:b/>
+                <w:color w:val="15803D"/>
+                <w:sz w:val="17"/>
+              </w:rPr>
+              <w:t>✅ Hoàn thành</w:t>
+            </w:r>
+          </w:p>
+        </w:tc>
+      </w:tr>
+      <w:tr>
+        <w:tc>
+          <w:tcPr>
+            <w:tcW w:type="dxa" w:w="864"/>
+            <w:shd w:fill="FFFFFF"/>
+            <w:tcMar>
+              <w:top w:w="80" w:type="dxa"/>
+              <w:bottom w:w="80" w:type="dxa"/>
+              <w:left w:w="90" w:type="dxa"/>
+              <w:right w:w="90" w:type="dxa"/>
+            </w:tcMar>
+            <w:vAlign w:val="center"/>
+          </w:tcPr>
+          <w:p>
+            <w:pPr>
+              <w:spacing w:before="0" w:after="0"/>
+              <w:jc w:val="center"/>
+            </w:pPr>
+            <w:r>
+              <w:rPr>
+                <w:rFonts w:ascii="Arial" w:hAnsi="Arial"/>
+                <w:b/>
+                <w:color w:val="1E293B"/>
+                <w:sz w:val="17"/>
+              </w:rPr>
+              <w:t>07</w:t>
+            </w:r>
+          </w:p>
+        </w:tc>
+        <w:tc>
+          <w:tcPr>
+            <w:tcW w:type="dxa" w:w="3168"/>
+            <w:shd w:fill="FFFFFF"/>
+            <w:tcMar>
+              <w:top w:w="80" w:type="dxa"/>
+              <w:bottom w:w="80" w:type="dxa"/>
+              <w:left w:w="90" w:type="dxa"/>
+              <w:right w:w="90" w:type="dxa"/>
+            </w:tcMar>
+            <w:vAlign w:val="center"/>
+          </w:tcPr>
+          <w:p>
+            <w:pPr>
+              <w:spacing w:before="0" w:after="0"/>
+            </w:pPr>
+            <w:r>
+              <w:rPr>
+                <w:rFonts w:ascii="Arial" w:hAnsi="Arial"/>
+                <w:b/>
+                <w:color w:val="0284C7"/>
+                <w:sz w:val="17"/>
+              </w:rPr>
+              <w:t>07-blind-judging.md</w:t>
+            </w:r>
+          </w:p>
+        </w:tc>
+        <w:tc>
+          <w:tcPr>
+            <w:tcW w:type="dxa" w:w="4752"/>
+            <w:shd w:fill="FFFFFF"/>
+            <w:tcMar>
+              <w:top w:w="80" w:type="dxa"/>
+              <w:bottom w:w="80" w:type="dxa"/>
+              <w:left w:w="90" w:type="dxa"/>
+              <w:right w:w="90" w:type="dxa"/>
+            </w:tcMar>
+            <w:vAlign w:val="center"/>
+          </w:tcPr>
+          <w:p>
+            <w:pPr>
+              <w:spacing w:before="0" w:after="0"/>
+            </w:pPr>
+            <w:r>
+              <w:rPr>
+                <w:rFonts w:ascii="Arial" w:hAnsi="Arial"/>
+                <w:color w:val="334155"/>
+                <w:sz w:val="17"/>
+              </w:rPr>
+              <w:t>Chấm thi ẩn danh kép BR-12, thuật toán phát hiện lệch điểm BR-14, tính điểm tổng kết có trọng số.</w:t>
+            </w:r>
+          </w:p>
+        </w:tc>
+        <w:tc>
+          <w:tcPr>
+            <w:tcW w:type="dxa" w:w="1584"/>
+            <w:shd w:fill="FFFFFF"/>
+            <w:tcMar>
+              <w:top w:w="80" w:type="dxa"/>
+              <w:bottom w:w="80" w:type="dxa"/>
+              <w:left w:w="90" w:type="dxa"/>
+              <w:right w:w="90" w:type="dxa"/>
+            </w:tcMar>
+            <w:vAlign w:val="center"/>
+          </w:tcPr>
+          <w:p>
+            <w:pPr>
+              <w:spacing w:before="0" w:after="0"/>
+              <w:jc w:val="center"/>
+            </w:pPr>
+            <w:r>
+              <w:rPr>
+                <w:rFonts w:ascii="Arial" w:hAnsi="Arial"/>
+                <w:b/>
+                <w:color w:val="15803D"/>
+                <w:sz w:val="17"/>
+              </w:rPr>
+              <w:t>✅ Đã merge</w:t>
+            </w:r>
+          </w:p>
+        </w:tc>
+      </w:tr>
+      <w:tr>
+        <w:tc>
+          <w:tcPr>
+            <w:tcW w:type="dxa" w:w="864"/>
+            <w:shd w:fill="F8FAFC"/>
+            <w:tcMar>
+              <w:top w:w="80" w:type="dxa"/>
+              <w:bottom w:w="80" w:type="dxa"/>
+              <w:left w:w="90" w:type="dxa"/>
+              <w:right w:w="90" w:type="dxa"/>
+            </w:tcMar>
+            <w:vAlign w:val="center"/>
+          </w:tcPr>
+          <w:p>
+            <w:pPr>
+              <w:spacing w:before="0" w:after="0"/>
+              <w:jc w:val="center"/>
+            </w:pPr>
+            <w:r>
+              <w:rPr>
+                <w:rFonts w:ascii="Arial" w:hAnsi="Arial"/>
+                <w:b/>
+                <w:color w:val="1E293B"/>
+                <w:sz w:val="17"/>
+              </w:rPr>
+              <w:t>08</w:t>
+            </w:r>
+          </w:p>
+        </w:tc>
+        <w:tc>
+          <w:tcPr>
+            <w:tcW w:type="dxa" w:w="3168"/>
+            <w:shd w:fill="F8FAFC"/>
+            <w:tcMar>
+              <w:top w:w="80" w:type="dxa"/>
+              <w:bottom w:w="80" w:type="dxa"/>
+              <w:left w:w="90" w:type="dxa"/>
+              <w:right w:w="90" w:type="dxa"/>
+            </w:tcMar>
+            <w:vAlign w:val="center"/>
+          </w:tcPr>
+          <w:p>
+            <w:pPr>
+              <w:spacing w:before="0" w:after="0"/>
+            </w:pPr>
+            <w:r>
+              <w:rPr>
+                <w:rFonts w:ascii="Arial" w:hAnsi="Arial"/>
+                <w:b/>
+                <w:color w:val="0284C7"/>
+                <w:sz w:val="17"/>
+              </w:rPr>
+              <w:t>08-archive-and-exhibition.md</w:t>
+            </w:r>
+          </w:p>
+        </w:tc>
+        <w:tc>
+          <w:tcPr>
+            <w:tcW w:type="dxa" w:w="4752"/>
+            <w:shd w:fill="F8FAFC"/>
+            <w:tcMar>
+              <w:top w:w="80" w:type="dxa"/>
+              <w:bottom w:w="80" w:type="dxa"/>
+              <w:left w:w="90" w:type="dxa"/>
+              <w:right w:w="90" w:type="dxa"/>
+            </w:tcMar>
+            <w:vAlign w:val="center"/>
+          </w:tcPr>
+          <w:p>
+            <w:pPr>
+              <w:spacing w:before="0" w:after="0"/>
+            </w:pPr>
+            <w:r>
+              <w:rPr>
+                <w:rFonts w:ascii="Arial" w:hAnsi="Arial"/>
+                <w:color w:val="334155"/>
+                <w:sz w:val="17"/>
+              </w:rPr>
+              <w:t>Triển lãm số, tìm kiếm nâng cao (faceted search theo AI tags), bảo vệ bản quyền &amp; watermark ảnh BR-16.</w:t>
+            </w:r>
+          </w:p>
+        </w:tc>
+        <w:tc>
+          <w:tcPr>
+            <w:tcW w:type="dxa" w:w="1584"/>
+            <w:shd w:fill="F8FAFC"/>
+            <w:tcMar>
+              <w:top w:w="80" w:type="dxa"/>
+              <w:bottom w:w="80" w:type="dxa"/>
+              <w:left w:w="90" w:type="dxa"/>
+              <w:right w:w="90" w:type="dxa"/>
+            </w:tcMar>
+            <w:vAlign w:val="center"/>
+          </w:tcPr>
+          <w:p>
+            <w:pPr>
+              <w:spacing w:before="0" w:after="0"/>
+              <w:jc w:val="center"/>
+            </w:pPr>
+            <w:r>
+              <w:rPr>
+                <w:rFonts w:ascii="Arial" w:hAnsi="Arial"/>
+                <w:b/>
+                <w:color w:val="15803D"/>
+                <w:sz w:val="17"/>
+              </w:rPr>
+              <w:t>✅ Hoàn thành</w:t>
+            </w:r>
+          </w:p>
+        </w:tc>
+      </w:tr>
+      <w:tr>
+        <w:tc>
+          <w:tcPr>
+            <w:tcW w:type="dxa" w:w="864"/>
+            <w:shd w:fill="FFFFFF"/>
+            <w:tcMar>
+              <w:top w:w="80" w:type="dxa"/>
+              <w:bottom w:w="80" w:type="dxa"/>
+              <w:left w:w="90" w:type="dxa"/>
+              <w:right w:w="90" w:type="dxa"/>
+            </w:tcMar>
+            <w:vAlign w:val="center"/>
+          </w:tcPr>
+          <w:p>
+            <w:pPr>
+              <w:spacing w:before="0" w:after="0"/>
+              <w:jc w:val="center"/>
+            </w:pPr>
+            <w:r>
+              <w:rPr>
+                <w:rFonts w:ascii="Arial" w:hAnsi="Arial"/>
+                <w:b/>
+                <w:color w:val="1E293B"/>
+                <w:sz w:val="17"/>
+              </w:rPr>
+              <w:t>09</w:t>
+            </w:r>
+          </w:p>
+        </w:tc>
+        <w:tc>
+          <w:tcPr>
+            <w:tcW w:type="dxa" w:w="3168"/>
+            <w:shd w:fill="FFFFFF"/>
+            <w:tcMar>
+              <w:top w:w="80" w:type="dxa"/>
+              <w:bottom w:w="80" w:type="dxa"/>
+              <w:left w:w="90" w:type="dxa"/>
+              <w:right w:w="90" w:type="dxa"/>
+            </w:tcMar>
+            <w:vAlign w:val="center"/>
+          </w:tcPr>
+          <w:p>
+            <w:pPr>
+              <w:spacing w:before="0" w:after="0"/>
+            </w:pPr>
+            <w:r>
+              <w:rPr>
+                <w:rFonts w:ascii="Arial" w:hAnsi="Arial"/>
+                <w:b/>
+                <w:color w:val="0284C7"/>
+                <w:sz w:val="17"/>
+              </w:rPr>
+              <w:t>09-api-contracts.md</w:t>
+            </w:r>
+          </w:p>
+        </w:tc>
+        <w:tc>
+          <w:tcPr>
+            <w:tcW w:type="dxa" w:w="4752"/>
+            <w:shd w:fill="FFFFFF"/>
+            <w:tcMar>
+              <w:top w:w="80" w:type="dxa"/>
+              <w:bottom w:w="80" w:type="dxa"/>
+              <w:left w:w="90" w:type="dxa"/>
+              <w:right w:w="90" w:type="dxa"/>
+            </w:tcMar>
+            <w:vAlign w:val="center"/>
+          </w:tcPr>
+          <w:p>
+            <w:pPr>
+              <w:spacing w:before="0" w:after="0"/>
+            </w:pPr>
+            <w:r>
+              <w:rPr>
+                <w:rFonts w:ascii="Arial" w:hAnsi="Arial"/>
+                <w:color w:val="334155"/>
+                <w:sz w:val="17"/>
+              </w:rPr>
+              <w:t>Chuẩn hóa Envelope Response {success, data, error, meta}, bộ DTOs TypeScript, chuẩn mã lỗi MSG-xxx.</w:t>
+            </w:r>
+          </w:p>
+        </w:tc>
+        <w:tc>
+          <w:tcPr>
+            <w:tcW w:type="dxa" w:w="1584"/>
+            <w:shd w:fill="FFFFFF"/>
+            <w:tcMar>
+              <w:top w:w="80" w:type="dxa"/>
+              <w:bottom w:w="80" w:type="dxa"/>
+              <w:left w:w="90" w:type="dxa"/>
+              <w:right w:w="90" w:type="dxa"/>
+            </w:tcMar>
+            <w:vAlign w:val="center"/>
+          </w:tcPr>
+          <w:p>
+            <w:pPr>
+              <w:spacing w:before="0" w:after="0"/>
+              <w:jc w:val="center"/>
+            </w:pPr>
+            <w:r>
+              <w:rPr>
+                <w:rFonts w:ascii="Arial" w:hAnsi="Arial"/>
+                <w:b/>
+                <w:color w:val="15803D"/>
+                <w:sz w:val="17"/>
+              </w:rPr>
+              <w:t>✅ Hoàn thành</w:t>
+            </w:r>
+          </w:p>
+        </w:tc>
+      </w:tr>
+      <w:tr>
+        <w:tc>
+          <w:tcPr>
+            <w:tcW w:type="dxa" w:w="864"/>
+            <w:shd w:fill="F8FAFC"/>
+            <w:tcMar>
+              <w:top w:w="80" w:type="dxa"/>
+              <w:bottom w:w="80" w:type="dxa"/>
+              <w:left w:w="90" w:type="dxa"/>
+              <w:right w:w="90" w:type="dxa"/>
+            </w:tcMar>
+            <w:vAlign w:val="center"/>
+          </w:tcPr>
+          <w:p>
+            <w:pPr>
+              <w:spacing w:before="0" w:after="0"/>
+              <w:jc w:val="center"/>
+            </w:pPr>
+            <w:r>
+              <w:rPr>
+                <w:rFonts w:ascii="Arial" w:hAnsi="Arial"/>
+                <w:b/>
+                <w:color w:val="1E293B"/>
+                <w:sz w:val="17"/>
+              </w:rPr>
+              <w:t>10</w:t>
+            </w:r>
+          </w:p>
+        </w:tc>
+        <w:tc>
+          <w:tcPr>
+            <w:tcW w:type="dxa" w:w="3168"/>
+            <w:shd w:fill="F8FAFC"/>
+            <w:tcMar>
+              <w:top w:w="80" w:type="dxa"/>
+              <w:bottom w:w="80" w:type="dxa"/>
+              <w:left w:w="90" w:type="dxa"/>
+              <w:right w:w="90" w:type="dxa"/>
+            </w:tcMar>
+            <w:vAlign w:val="center"/>
+          </w:tcPr>
+          <w:p>
+            <w:pPr>
+              <w:spacing w:before="0" w:after="0"/>
+            </w:pPr>
+            <w:r>
+              <w:rPr>
+                <w:rFonts w:ascii="Arial" w:hAnsi="Arial"/>
+                <w:b/>
+                <w:color w:val="0284C7"/>
+                <w:sz w:val="17"/>
+              </w:rPr>
+              <w:t>10-database-and-storage.md</w:t>
+            </w:r>
+          </w:p>
+        </w:tc>
+        <w:tc>
+          <w:tcPr>
+            <w:tcW w:type="dxa" w:w="4752"/>
+            <w:shd w:fill="F8FAFC"/>
+            <w:tcMar>
+              <w:top w:w="80" w:type="dxa"/>
+              <w:bottom w:w="80" w:type="dxa"/>
+              <w:left w:w="90" w:type="dxa"/>
+              <w:right w:w="90" w:type="dxa"/>
+            </w:tcMar>
+            <w:vAlign w:val="center"/>
+          </w:tcPr>
+          <w:p>
+            <w:pPr>
+              <w:spacing w:before="0" w:after="0"/>
+            </w:pPr>
+            <w:r>
+              <w:rPr>
+                <w:rFonts w:ascii="Arial" w:hAnsi="Arial"/>
+                <w:color w:val="334155"/>
+                <w:sz w:val="17"/>
+              </w:rPr>
+              <w:t>Kiến trúc PostgreSQL 16 + pgvector, presigned URLs Cloudflare R2 / AWS S3, cấu hình pool kết nối.</w:t>
+            </w:r>
+          </w:p>
+        </w:tc>
+        <w:tc>
+          <w:tcPr>
+            <w:tcW w:type="dxa" w:w="1584"/>
+            <w:shd w:fill="F8FAFC"/>
+            <w:tcMar>
+              <w:top w:w="80" w:type="dxa"/>
+              <w:bottom w:w="80" w:type="dxa"/>
+              <w:left w:w="90" w:type="dxa"/>
+              <w:right w:w="90" w:type="dxa"/>
+            </w:tcMar>
+            <w:vAlign w:val="center"/>
+          </w:tcPr>
+          <w:p>
+            <w:pPr>
+              <w:spacing w:before="0" w:after="0"/>
+              <w:jc w:val="center"/>
+            </w:pPr>
+            <w:r>
+              <w:rPr>
+                <w:rFonts w:ascii="Arial" w:hAnsi="Arial"/>
+                <w:b/>
+                <w:color w:val="15803D"/>
+                <w:sz w:val="17"/>
+              </w:rPr>
+              <w:t>✅ Hoàn thành</w:t>
             </w:r>
           </w:p>
         </w:tc>
@@ -709,26 +2240,99 @@
     </w:tbl>
     <w:p>
       <w:pPr>
-        <w:spacing w:after="120"/>
+        <w:spacing w:before="280" w:after="80"/>
       </w:pPr>
+      <w:r>
+        <w:rPr>
+          <w:rFonts w:ascii="Arial" w:hAnsi="Arial"/>
+          <w:b/>
+          <w:color w:val="1E3A8A"/>
+          <w:sz w:val="26"/>
+        </w:rPr>
+        <w:t>IV. RÀ SOÁT KỸ THUẬT &amp; TRỌNG TÂM HOÀN THIỆN</w:t>
+      </w:r>
     </w:p>
     <w:p>
       <w:pPr>
-        <w:keepNext/>
-        <w:spacing w:before="240" w:after="100"/>
+        <w:pStyle w:val="ListBullet"/>
+        <w:spacing w:before="40" w:after="60"/>
       </w:pPr>
       <w:r>
         <w:rPr>
+          <w:rFonts w:ascii="Arial" w:hAnsi="Arial"/>
           <w:b/>
-          <w:color w:val="1F4E78"/>
-          <w:sz w:val="24"/>
+          <w:color w:val="0F172A"/>
+          <w:sz w:val="19"/>
         </w:rPr>
-        <w:t>III. RÀ SOÁT CHẤT LƯỢNG 8 MODULE SPECS ĐÃ MERGE &amp; ĐỐI CHIẾU SRS</w:t>
+        <w:t xml:space="preserve">Đồng bộ quy ước đặt tên (Naming Convention): </w:t>
+      </w:r>
+      <w:r>
+        <w:rPr>
+          <w:rFonts w:ascii="Arial" w:hAnsi="Arial"/>
+          <w:color w:val="334155"/>
+          <w:sz w:val="19"/>
+        </w:rPr>
+        <w:t>Rà soát toàn bộ tài liệu đặc tả để đồng nhất 100% tên bảng cơ sở dữ liệu và khóa ngoại sang định dạng snake_case (film_rolls, film_frames, submissions) khớp hoàn toàn với schema Drizzle ORM trong apps/api/src/db/schema.ts.</w:t>
       </w:r>
     </w:p>
     <w:p>
+      <w:pPr>
+        <w:pStyle w:val="ListBullet"/>
+        <w:spacing w:before="40" w:after="60"/>
+      </w:pPr>
       <w:r>
-        <w:t>Kết quả đối chiếu chi tiết 8 tài liệu đã merge vào develop với tài liệu SRS Google Docs:</w:t>
+        <w:rPr>
+          <w:rFonts w:ascii="Arial" w:hAnsi="Arial"/>
+          <w:b/>
+          <w:color w:val="0F172A"/>
+          <w:sz w:val="19"/>
+        </w:rPr>
+        <w:t xml:space="preserve">Bổ sung Zod Validation Schema chi tiết: </w:t>
+      </w:r>
+      <w:r>
+        <w:rPr>
+          <w:rFonts w:ascii="Arial" w:hAnsi="Arial"/>
+          <w:color w:val="334155"/>
+          <w:sz w:val="19"/>
+        </w:rPr>
+        <w:t>Mở rộng và chuẩn hóa các schema xác thực dữ liệu đầu vào (Zod schemas) cũng như đầy đủ các endpoint CRUD mở rộng (GET filter, chi tiết ID, soft delete) cho module 04 và 05.</w:t>
+      </w:r>
+    </w:p>
+    <w:p>
+      <w:pPr>
+        <w:pStyle w:val="ListBullet"/>
+        <w:spacing w:before="40" w:after="60"/>
+      </w:pPr>
+      <w:r>
+        <w:rPr>
+          <w:rFonts w:ascii="Arial" w:hAnsi="Arial"/>
+          <w:b/>
+          <w:color w:val="0F172A"/>
+          <w:sz w:val="19"/>
+        </w:rPr>
+        <w:t xml:space="preserve">Tích hợp Luồng Xử lý Hàng đợi (Message Queue): </w:t>
+      </w:r>
+      <w:r>
+        <w:rPr>
+          <w:rFonts w:ascii="Arial" w:hAnsi="Arial"/>
+          <w:color w:val="334155"/>
+          <w:sz w:val="19"/>
+        </w:rPr>
+        <w:t>Đặc tả chi tiết giao thức giao tiếp giữa API và Redis BullMQ Worker để thực thi bất đồng bộ tiến trình trích xuất vector CLIP và tính toán khoảng cách Hamming pHash khi bài thi được nộp.</w:t>
+      </w:r>
+    </w:p>
+    <w:p>
+      <w:pPr>
+        <w:spacing w:before="280" w:after="80"/>
+      </w:pPr>
+      <w:r>
+        <w:rPr>
+          <w:rFonts w:ascii="Arial" w:hAnsi="Arial"/>
+          <w:b/>
+          <w:color w:val="1E3A8A"/>
+          <w:sz w:val="26"/>
+        </w:rPr>
+        <w:t>V. KẾ HOẠCH HÀNH ĐỘNG TIẾP THEO (ACTION PLAN)</w:t>
       </w:r>
     </w:p>
     <w:tbl>
@@ -737,22 +2341,503 @@
         <w:jc w:val="center"/>
         <w:tblLayout w:type="fixed"/>
         <w:tblLook w:firstColumn="1" w:firstRow="1" w:lastColumn="0" w:lastRow="0" w:noHBand="0" w:noVBand="1" w:val="04A0"/>
+        <w:tblBorders>
+          <w:top w:val="single" w:sz="4" w:space="0" w:color="D1D5DB"/>
+          <w:bottom w:val="single" w:sz="4" w:space="0" w:color="D1D5DB"/>
+          <w:insideH w:val="single" w:sz="4" w:space="0" w:color="D1D5DB"/>
+          <w:insideV w:val="none"/>
+          <w:left w:val="none"/>
+          <w:right w:val="none"/>
+        </w:tblBorders>
       </w:tblPr>
       <w:tblGrid>
-        <w:gridCol w:w="1987"/>
-        <w:gridCol w:w="1987"/>
-        <w:gridCol w:w="1987"/>
-        <w:gridCol w:w="1987"/>
-        <w:gridCol w:w="1987"/>
+        <w:gridCol w:w="2592"/>
+        <w:gridCol w:w="2592"/>
+        <w:gridCol w:w="2592"/>
+        <w:gridCol w:w="2592"/>
       </w:tblGrid>
       <w:tr>
         <w:tc>
           <w:tcPr>
-            <w:tcW w:type="dxa" w:w="2160"/>
-            <w:shd w:fill="2E75B6"/>
+            <w:tcW w:type="dxa" w:w="864"/>
+            <w:shd w:fill="1E293B"/>
             <w:tcMar>
-              <w:top w:w="70" w:type="dxa"/>
-              <w:bottom w:w="70" w:type="dxa"/>
+              <w:top w:w="100" w:type="dxa"/>
+              <w:bottom w:w="100" w:type="dxa"/>
+              <w:left w:w="100" w:type="dxa"/>
+              <w:right w:w="100" w:type="dxa"/>
+            </w:tcMar>
+          </w:tcPr>
+          <w:p>
+            <w:pPr>
+              <w:spacing w:before="0" w:after="0"/>
+              <w:jc w:val="center"/>
+            </w:pPr>
+            <w:r>
+              <w:rPr>
+                <w:rFonts w:ascii="Arial" w:hAnsi="Arial"/>
+                <w:b/>
+                <w:color w:val="FFFFFF"/>
+                <w:sz w:val="19"/>
+              </w:rPr>
+              <w:t>Hạng mục</w:t>
+            </w:r>
+          </w:p>
+        </w:tc>
+        <w:tc>
+          <w:tcPr>
+            <w:tcW w:type="dxa" w:w="3168"/>
+            <w:shd w:fill="1E293B"/>
+            <w:tcMar>
+              <w:top w:w="100" w:type="dxa"/>
+              <w:bottom w:w="100" w:type="dxa"/>
+              <w:left w:w="100" w:type="dxa"/>
+              <w:right w:w="100" w:type="dxa"/>
+            </w:tcMar>
+          </w:tcPr>
+          <w:p>
+            <w:pPr>
+              <w:spacing w:before="0" w:after="0"/>
+            </w:pPr>
+            <w:r>
+              <w:rPr>
+                <w:rFonts w:ascii="Arial" w:hAnsi="Arial"/>
+                <w:b/>
+                <w:color w:val="FFFFFF"/>
+                <w:sz w:val="19"/>
+              </w:rPr>
+              <w:t>Nội dung Thực hiện</w:t>
+            </w:r>
+          </w:p>
+        </w:tc>
+        <w:tc>
+          <w:tcPr>
+            <w:tcW w:type="dxa" w:w="4608"/>
+            <w:shd w:fill="1E293B"/>
+            <w:tcMar>
+              <w:top w:w="100" w:type="dxa"/>
+              <w:bottom w:w="100" w:type="dxa"/>
+              <w:left w:w="100" w:type="dxa"/>
+              <w:right w:w="100" w:type="dxa"/>
+            </w:tcMar>
+          </w:tcPr>
+          <w:p>
+            <w:pPr>
+              <w:spacing w:before="0" w:after="0"/>
+            </w:pPr>
+            <w:r>
+              <w:rPr>
+                <w:rFonts w:ascii="Arial" w:hAnsi="Arial"/>
+                <w:b/>
+                <w:color w:val="FFFFFF"/>
+                <w:sz w:val="19"/>
+              </w:rPr>
+              <w:t>Đầu ra Kỹ thuật Dự kiến</w:t>
+            </w:r>
+          </w:p>
+        </w:tc>
+        <w:tc>
+          <w:tcPr>
+            <w:tcW w:type="dxa" w:w="1728"/>
+            <w:shd w:fill="1E293B"/>
+            <w:tcMar>
+              <w:top w:w="100" w:type="dxa"/>
+              <w:bottom w:w="100" w:type="dxa"/>
+              <w:left w:w="100" w:type="dxa"/>
+              <w:right w:w="100" w:type="dxa"/>
+            </w:tcMar>
+          </w:tcPr>
+          <w:p>
+            <w:pPr>
+              <w:spacing w:before="0" w:after="0"/>
+              <w:jc w:val="center"/>
+            </w:pPr>
+            <w:r>
+              <w:rPr>
+                <w:rFonts w:ascii="Arial" w:hAnsi="Arial"/>
+                <w:b/>
+                <w:color w:val="FFFFFF"/>
+                <w:sz w:val="19"/>
+              </w:rPr>
+              <w:t>Thời hạn</w:t>
+            </w:r>
+          </w:p>
+        </w:tc>
+      </w:tr>
+      <w:tr>
+        <w:tc>
+          <w:tcPr>
+            <w:tcW w:type="dxa" w:w="864"/>
+            <w:shd w:fill="FFFFFF"/>
+            <w:tcMar>
+              <w:top w:w="90" w:type="dxa"/>
+              <w:bottom w:w="90" w:type="dxa"/>
+              <w:left w:w="90" w:type="dxa"/>
+              <w:right w:w="90" w:type="dxa"/>
+            </w:tcMar>
+            <w:vAlign w:val="center"/>
+          </w:tcPr>
+          <w:p>
+            <w:pPr>
+              <w:spacing w:before="0" w:after="0"/>
+              <w:jc w:val="center"/>
+            </w:pPr>
+            <w:r>
+              <w:rPr>
+                <w:rFonts w:ascii="Arial" w:hAnsi="Arial"/>
+                <w:b/>
+                <w:color w:val="1E293B"/>
+                <w:sz w:val="17"/>
+              </w:rPr>
+              <w:t>01</w:t>
+            </w:r>
+          </w:p>
+        </w:tc>
+        <w:tc>
+          <w:tcPr>
+            <w:tcW w:type="dxa" w:w="3168"/>
+            <w:shd w:fill="FFFFFF"/>
+            <w:tcMar>
+              <w:top w:w="90" w:type="dxa"/>
+              <w:bottom w:w="90" w:type="dxa"/>
+              <w:left w:w="90" w:type="dxa"/>
+              <w:right w:w="90" w:type="dxa"/>
+            </w:tcMar>
+            <w:vAlign w:val="center"/>
+          </w:tcPr>
+          <w:p>
+            <w:pPr>
+              <w:spacing w:before="0" w:after="0"/>
+            </w:pPr>
+            <w:r>
+              <w:rPr>
+                <w:rFonts w:ascii="Arial" w:hAnsi="Arial"/>
+                <w:b/>
+                <w:color w:val="1D4ED8"/>
+                <w:sz w:val="17"/>
+              </w:rPr>
+              <w:t>Tinh chỉnh &amp; Đồng bộ Zod Schemas</w:t>
+            </w:r>
+          </w:p>
+        </w:tc>
+        <w:tc>
+          <w:tcPr>
+            <w:tcW w:type="dxa" w:w="4608"/>
+            <w:shd w:fill="FFFFFF"/>
+            <w:tcMar>
+              <w:top w:w="90" w:type="dxa"/>
+              <w:bottom w:w="90" w:type="dxa"/>
+              <w:left w:w="90" w:type="dxa"/>
+              <w:right w:w="90" w:type="dxa"/>
+            </w:tcMar>
+            <w:vAlign w:val="center"/>
+          </w:tcPr>
+          <w:p>
+            <w:pPr>
+              <w:spacing w:before="0" w:after="0"/>
+            </w:pPr>
+            <w:r>
+              <w:rPr>
+                <w:rFonts w:ascii="Arial" w:hAnsi="Arial"/>
+                <w:color w:val="334155"/>
+                <w:sz w:val="17"/>
+              </w:rPr>
+              <w:t>Hoàn thiện 100% Zod validation schemas và CRUD endpoints trên docs/</w:t>
+            </w:r>
+          </w:p>
+        </w:tc>
+        <w:tc>
+          <w:tcPr>
+            <w:tcW w:type="dxa" w:w="1728"/>
+            <w:shd w:fill="FFFFFF"/>
+            <w:tcMar>
+              <w:top w:w="90" w:type="dxa"/>
+              <w:bottom w:w="90" w:type="dxa"/>
+              <w:left w:w="90" w:type="dxa"/>
+              <w:right w:w="90" w:type="dxa"/>
+            </w:tcMar>
+            <w:vAlign w:val="center"/>
+          </w:tcPr>
+          <w:p>
+            <w:pPr>
+              <w:spacing w:before="0" w:after="0"/>
+              <w:jc w:val="center"/>
+            </w:pPr>
+            <w:r>
+              <w:rPr>
+                <w:rFonts w:ascii="Arial" w:hAnsi="Arial"/>
+                <w:color w:val="64748B"/>
+                <w:sz w:val="17"/>
+              </w:rPr>
+              <w:t>29/10/2026</w:t>
+            </w:r>
+          </w:p>
+        </w:tc>
+      </w:tr>
+      <w:tr>
+        <w:tc>
+          <w:tcPr>
+            <w:tcW w:type="dxa" w:w="864"/>
+            <w:shd w:fill="F8FAFC"/>
+            <w:tcMar>
+              <w:top w:w="90" w:type="dxa"/>
+              <w:bottom w:w="90" w:type="dxa"/>
+              <w:left w:w="90" w:type="dxa"/>
+              <w:right w:w="90" w:type="dxa"/>
+            </w:tcMar>
+            <w:vAlign w:val="center"/>
+          </w:tcPr>
+          <w:p>
+            <w:pPr>
+              <w:spacing w:before="0" w:after="0"/>
+              <w:jc w:val="center"/>
+            </w:pPr>
+            <w:r>
+              <w:rPr>
+                <w:rFonts w:ascii="Arial" w:hAnsi="Arial"/>
+                <w:b/>
+                <w:color w:val="1E293B"/>
+                <w:sz w:val="17"/>
+              </w:rPr>
+              <w:t>02</w:t>
+            </w:r>
+          </w:p>
+        </w:tc>
+        <w:tc>
+          <w:tcPr>
+            <w:tcW w:type="dxa" w:w="3168"/>
+            <w:shd w:fill="F8FAFC"/>
+            <w:tcMar>
+              <w:top w:w="90" w:type="dxa"/>
+              <w:bottom w:w="90" w:type="dxa"/>
+              <w:left w:w="90" w:type="dxa"/>
+              <w:right w:w="90" w:type="dxa"/>
+            </w:tcMar>
+            <w:vAlign w:val="center"/>
+          </w:tcPr>
+          <w:p>
+            <w:pPr>
+              <w:spacing w:before="0" w:after="0"/>
+            </w:pPr>
+            <w:r>
+              <w:rPr>
+                <w:rFonts w:ascii="Arial" w:hAnsi="Arial"/>
+                <w:b/>
+                <w:color w:val="1D4ED8"/>
+                <w:sz w:val="17"/>
+              </w:rPr>
+              <w:t>Khởi động Sprint Sinh Mã Nguồn AI</w:t>
+            </w:r>
+          </w:p>
+        </w:tc>
+        <w:tc>
+          <w:tcPr>
+            <w:tcW w:type="dxa" w:w="4608"/>
+            <w:shd w:fill="F8FAFC"/>
+            <w:tcMar>
+              <w:top w:w="90" w:type="dxa"/>
+              <w:bottom w:w="90" w:type="dxa"/>
+              <w:left w:w="90" w:type="dxa"/>
+              <w:right w:w="90" w:type="dxa"/>
+            </w:tcMar>
+            <w:vAlign w:val="center"/>
+          </w:tcPr>
+          <w:p>
+            <w:pPr>
+              <w:spacing w:before="0" w:after="0"/>
+            </w:pPr>
+            <w:r>
+              <w:rPr>
+                <w:rFonts w:ascii="Arial" w:hAnsi="Arial"/>
+                <w:color w:val="334155"/>
+                <w:sz w:val="17"/>
+              </w:rPr>
+              <w:t>Ứng dụng AI Coding Assistants sinh code đồng bộ cho API Hono, Web &amp; Mobile</w:t>
+            </w:r>
+          </w:p>
+        </w:tc>
+        <w:tc>
+          <w:tcPr>
+            <w:tcW w:type="dxa" w:w="1728"/>
+            <w:shd w:fill="F8FAFC"/>
+            <w:tcMar>
+              <w:top w:w="90" w:type="dxa"/>
+              <w:bottom w:w="90" w:type="dxa"/>
+              <w:left w:w="90" w:type="dxa"/>
+              <w:right w:w="90" w:type="dxa"/>
+            </w:tcMar>
+            <w:vAlign w:val="center"/>
+          </w:tcPr>
+          <w:p>
+            <w:pPr>
+              <w:spacing w:before="0" w:after="0"/>
+              <w:jc w:val="center"/>
+            </w:pPr>
+            <w:r>
+              <w:rPr>
+                <w:rFonts w:ascii="Arial" w:hAnsi="Arial"/>
+                <w:color w:val="64748B"/>
+                <w:sz w:val="17"/>
+              </w:rPr>
+              <w:t>30/10/2026</w:t>
+            </w:r>
+          </w:p>
+        </w:tc>
+      </w:tr>
+      <w:tr>
+        <w:tc>
+          <w:tcPr>
+            <w:tcW w:type="dxa" w:w="864"/>
+            <w:shd w:fill="FFFFFF"/>
+            <w:tcMar>
+              <w:top w:w="90" w:type="dxa"/>
+              <w:bottom w:w="90" w:type="dxa"/>
+              <w:left w:w="90" w:type="dxa"/>
+              <w:right w:w="90" w:type="dxa"/>
+            </w:tcMar>
+            <w:vAlign w:val="center"/>
+          </w:tcPr>
+          <w:p>
+            <w:pPr>
+              <w:spacing w:before="0" w:after="0"/>
+              <w:jc w:val="center"/>
+            </w:pPr>
+            <w:r>
+              <w:rPr>
+                <w:rFonts w:ascii="Arial" w:hAnsi="Arial"/>
+                <w:b/>
+                <w:color w:val="1E293B"/>
+                <w:sz w:val="17"/>
+              </w:rPr>
+              <w:t>03</w:t>
+            </w:r>
+          </w:p>
+        </w:tc>
+        <w:tc>
+          <w:tcPr>
+            <w:tcW w:type="dxa" w:w="3168"/>
+            <w:shd w:fill="FFFFFF"/>
+            <w:tcMar>
+              <w:top w:w="90" w:type="dxa"/>
+              <w:bottom w:w="90" w:type="dxa"/>
+              <w:left w:w="90" w:type="dxa"/>
+              <w:right w:w="90" w:type="dxa"/>
+            </w:tcMar>
+            <w:vAlign w:val="center"/>
+          </w:tcPr>
+          <w:p>
+            <w:pPr>
+              <w:spacing w:before="0" w:after="0"/>
+            </w:pPr>
+            <w:r>
+              <w:rPr>
+                <w:rFonts w:ascii="Arial" w:hAnsi="Arial"/>
+                <w:b/>
+                <w:color w:val="1D4ED8"/>
+                <w:sz w:val="17"/>
+              </w:rPr>
+              <w:t>Kiểm thử Tự động &amp; Tích hợp E2E</w:t>
+            </w:r>
+          </w:p>
+        </w:tc>
+        <w:tc>
+          <w:tcPr>
+            <w:tcW w:type="dxa" w:w="4608"/>
+            <w:shd w:fill="FFFFFF"/>
+            <w:tcMar>
+              <w:top w:w="90" w:type="dxa"/>
+              <w:bottom w:w="90" w:type="dxa"/>
+              <w:left w:w="90" w:type="dxa"/>
+              <w:right w:w="90" w:type="dxa"/>
+            </w:tcMar>
+            <w:vAlign w:val="center"/>
+          </w:tcPr>
+          <w:p>
+            <w:pPr>
+              <w:spacing w:before="0" w:after="0"/>
+            </w:pPr>
+            <w:r>
+              <w:rPr>
+                <w:rFonts w:ascii="Arial" w:hAnsi="Arial"/>
+                <w:color w:val="334155"/>
+                <w:sz w:val="17"/>
+              </w:rPr>
+              <w:t>Bộ Unit/Integration Test cho luồng Chấm thi ẩn danh, Nộp bài thi (Coverage &gt;= 85%)</w:t>
+            </w:r>
+          </w:p>
+        </w:tc>
+        <w:tc>
+          <w:tcPr>
+            <w:tcW w:type="dxa" w:w="1728"/>
+            <w:shd w:fill="FFFFFF"/>
+            <w:tcMar>
+              <w:top w:w="90" w:type="dxa"/>
+              <w:bottom w:w="90" w:type="dxa"/>
+              <w:left w:w="90" w:type="dxa"/>
+              <w:right w:w="90" w:type="dxa"/>
+            </w:tcMar>
+            <w:vAlign w:val="center"/>
+          </w:tcPr>
+          <w:p>
+            <w:pPr>
+              <w:spacing w:before="0" w:after="0"/>
+              <w:jc w:val="center"/>
+            </w:pPr>
+            <w:r>
+              <w:rPr>
+                <w:rFonts w:ascii="Arial" w:hAnsi="Arial"/>
+                <w:color w:val="64748B"/>
+                <w:sz w:val="17"/>
+              </w:rPr>
+              <w:t>02/11/2026</w:t>
+            </w:r>
+          </w:p>
+        </w:tc>
+      </w:tr>
+    </w:tbl>
+    <w:p>
+      <w:pPr>
+        <w:spacing w:before="320" w:after="0"/>
+      </w:pPr>
+    </w:p>
+    <w:tbl>
+      <w:tblPr>
+        <w:tblW w:type="auto" w:w="0"/>
+        <w:jc w:val="center"/>
+        <w:tblLayout w:type="fixed"/>
+        <w:tblLook w:firstColumn="1" w:firstRow="1" w:lastColumn="0" w:lastRow="0" w:noHBand="0" w:noVBand="1" w:val="04A0"/>
+        <w:tblBorders>
+          <w:top w:val="none" w:sz="0" w:space="0" w:color="FFFFFF"/>
+          <w:bottom w:val="none" w:sz="0" w:space="0" w:color="FFFFFF"/>
+          <w:insideH w:val="none" w:sz="0" w:space="0" w:color="FFFFFF"/>
+          <w:insideV w:val="none"/>
+          <w:left w:val="none"/>
+          <w:right w:val="none"/>
+        </w:tblBorders>
+      </w:tblPr>
+      <w:tblGrid>
+        <w:gridCol w:w="5184"/>
+        <w:gridCol w:w="5184"/>
+      </w:tblGrid>
+      <w:tr>
+        <w:tc>
+          <w:tcPr>
+            <w:tcW w:type="dxa" w:w="5184"/>
+            <w:tcMar>
+              <w:top w:w="60" w:type="dxa"/>
+              <w:bottom w:w="60" w:type="dxa"/>
+              <w:left w:w="60" w:type="dxa"/>
+              <w:right w:w="60" w:type="dxa"/>
+            </w:tcMar>
+          </w:tcPr>
+          <w:p/>
+        </w:tc>
+        <w:tc>
+          <w:tcPr>
+            <w:tcW w:type="dxa" w:w="5184"/>
+            <w:tcMar>
+              <w:top w:w="60" w:type="dxa"/>
+              <w:bottom w:w="60" w:type="dxa"/>
               <w:left w:w="60" w:type="dxa"/>
               <w:right w:w="60" w:type="dxa"/>
             </w:tcMar>
@@ -763,1387 +2848,40 @@
             </w:pPr>
             <w:r>
               <w:rPr>
-                <w:b/>
-                <w:color w:val="FFFFFF"/>
-                <w:sz w:val="18"/>
+                <w:rFonts w:ascii="Arial" w:hAnsi="Arial"/>
+                <w:i/>
+                <w:color w:val="475569"/>
+                <w:sz w:val="20"/>
               </w:rPr>
-              <w:t>Module &amp; Tệp</w:t>
+              <w:t>Báo cáo được lập &amp; xác nhận bởi:</w:t>
+              <w:br/>
             </w:r>
-          </w:p>
-        </w:tc>
-        <w:tc>
-          <w:tcPr>
-            <w:tcW w:type="dxa" w:w="1584"/>
-            <w:shd w:fill="2E75B6"/>
-            <w:tcMar>
-              <w:top w:w="70" w:type="dxa"/>
-              <w:bottom w:w="70" w:type="dxa"/>
-              <w:left w:w="60" w:type="dxa"/>
-              <w:right w:w="60" w:type="dxa"/>
-            </w:tcMar>
-          </w:tcPr>
-          <w:p>
-            <w:pPr>
-              <w:jc w:val="center"/>
-            </w:pPr>
             <w:r>
               <w:rPr>
+                <w:rFonts w:ascii="Arial" w:hAnsi="Arial"/>
                 <w:b/>
-                <w:color w:val="FFFFFF"/>
-                <w:sz w:val="18"/>
+                <w:color w:val="1E293B"/>
+                <w:sz w:val="22"/>
               </w:rPr>
-              <w:t>Tác giả</w:t>
+              <w:t>BAN KỸ THUẬT DỰ ÁN FILM CONTEST</w:t>
+              <w:br/>
             </w:r>
-          </w:p>
-        </w:tc>
-        <w:tc>
-          <w:tcPr>
-            <w:tcW w:type="dxa" w:w="1584"/>
-            <w:shd w:fill="2E75B6"/>
-            <w:tcMar>
-              <w:top w:w="70" w:type="dxa"/>
-              <w:bottom w:w="70" w:type="dxa"/>
-              <w:left w:w="60" w:type="dxa"/>
-              <w:right w:w="60" w:type="dxa"/>
-            </w:tcMar>
-          </w:tcPr>
-          <w:p>
-            <w:pPr>
-              <w:jc w:val="center"/>
-            </w:pPr>
             <w:r>
               <w:rPr>
+                <w:rFonts w:ascii="Arial" w:hAnsi="Arial"/>
                 <w:b/>
-                <w:color w:val="FFFFFF"/>
-                <w:sz w:val="18"/>
+                <w:color w:val="2563EB"/>
+                <w:sz w:val="21"/>
               </w:rPr>
-              <w:t>Chuẩn AI-First</w:t>
-            </w:r>
-          </w:p>
-        </w:tc>
-        <w:tc>
-          <w:tcPr>
-            <w:tcW w:type="dxa" w:w="1584"/>
-            <w:shd w:fill="2E75B6"/>
-            <w:tcMar>
-              <w:top w:w="70" w:type="dxa"/>
-              <w:bottom w:w="70" w:type="dxa"/>
-              <w:left w:w="60" w:type="dxa"/>
-              <w:right w:w="60" w:type="dxa"/>
-            </w:tcMar>
-          </w:tcPr>
-          <w:p>
-            <w:pPr>
-              <w:jc w:val="center"/>
-            </w:pPr>
-            <w:r>
-              <w:rPr>
-                <w:b/>
-                <w:color w:val="FFFFFF"/>
-                <w:sz w:val="18"/>
-              </w:rPr>
-              <w:t>Độ khớp SRS</w:t>
-            </w:r>
-          </w:p>
-        </w:tc>
-        <w:tc>
-          <w:tcPr>
-            <w:tcW w:type="dxa" w:w="2592"/>
-            <w:shd w:fill="2E75B6"/>
-            <w:tcMar>
-              <w:top w:w="70" w:type="dxa"/>
-              <w:bottom w:w="70" w:type="dxa"/>
-              <w:left w:w="60" w:type="dxa"/>
-              <w:right w:w="60" w:type="dxa"/>
-            </w:tcMar>
-          </w:tcPr>
-          <w:p>
-            <w:pPr>
-              <w:jc w:val="center"/>
-            </w:pPr>
-            <w:r>
-              <w:rPr>
-                <w:b/>
-                <w:color w:val="FFFFFF"/>
-                <w:sz w:val="18"/>
-              </w:rPr>
-              <w:t>Nhận xét &amp; Tồn đọng</w:t>
-            </w:r>
-          </w:p>
-        </w:tc>
-      </w:tr>
-      <w:tr>
-        <w:tc>
-          <w:tcPr>
-            <w:tcW w:type="dxa" w:w="2160"/>
-            <w:shd w:fill="FFFFFF"/>
-            <w:tcMar>
-              <w:top w:w="50" w:type="dxa"/>
-              <w:bottom w:w="50" w:type="dxa"/>
-              <w:left w:w="60" w:type="dxa"/>
-              <w:right w:w="60" w:type="dxa"/>
-            </w:tcMar>
-          </w:tcPr>
-          <w:p>
-            <w:pPr>
-              <w:spacing w:line="264" w:lineRule="auto" w:after="40"/>
-            </w:pPr>
-            <w:r>
-              <w:rPr>
-                <w:sz w:val="17"/>
-              </w:rPr>
-              <w:t>01-auth-and-rbac.md</w:t>
-            </w:r>
-          </w:p>
-        </w:tc>
-        <w:tc>
-          <w:tcPr>
-            <w:tcW w:type="dxa" w:w="1584"/>
-            <w:shd w:fill="FFFFFF"/>
-            <w:tcMar>
-              <w:top w:w="50" w:type="dxa"/>
-              <w:bottom w:w="50" w:type="dxa"/>
-              <w:left w:w="60" w:type="dxa"/>
-              <w:right w:w="60" w:type="dxa"/>
-            </w:tcMar>
-          </w:tcPr>
-          <w:p>
-            <w:pPr>
-              <w:spacing w:line="264" w:lineRule="auto" w:after="40"/>
-              <w:jc w:val="center"/>
-            </w:pPr>
-            <w:r>
-              <w:rPr>
-                <w:sz w:val="17"/>
-              </w:rPr>
-              <w:t>huynhbao1710</w:t>
-            </w:r>
-          </w:p>
-        </w:tc>
-        <w:tc>
-          <w:tcPr>
-            <w:tcW w:type="dxa" w:w="1584"/>
-            <w:shd w:fill="FFFFFF"/>
-            <w:tcMar>
-              <w:top w:w="50" w:type="dxa"/>
-              <w:bottom w:w="50" w:type="dxa"/>
-              <w:left w:w="60" w:type="dxa"/>
-              <w:right w:w="60" w:type="dxa"/>
-            </w:tcMar>
-          </w:tcPr>
-          <w:p>
-            <w:pPr>
-              <w:spacing w:line="264" w:lineRule="auto" w:after="40"/>
-              <w:jc w:val="center"/>
-            </w:pPr>
-            <w:r>
-              <w:rPr>
-                <w:b/>
-                <w:color w:val="1E7E34"/>
-                <w:sz w:val="17"/>
-              </w:rPr>
-              <w:t>Xuất sắc (5/5)</w:t>
-            </w:r>
-          </w:p>
-        </w:tc>
-        <w:tc>
-          <w:tcPr>
-            <w:tcW w:type="dxa" w:w="1584"/>
-            <w:shd w:fill="FFFFFF"/>
-            <w:tcMar>
-              <w:top w:w="50" w:type="dxa"/>
-              <w:bottom w:w="50" w:type="dxa"/>
-              <w:left w:w="60" w:type="dxa"/>
-              <w:right w:w="60" w:type="dxa"/>
-            </w:tcMar>
-          </w:tcPr>
-          <w:p>
-            <w:pPr>
-              <w:spacing w:line="264" w:lineRule="auto" w:after="40"/>
-            </w:pPr>
-            <w:r>
-              <w:rPr>
-                <w:sz w:val="17"/>
-              </w:rPr>
-              <w:t>100% (BR-01,02,04)</w:t>
-            </w:r>
-          </w:p>
-        </w:tc>
-        <w:tc>
-          <w:tcPr>
-            <w:tcW w:type="dxa" w:w="2592"/>
-            <w:shd w:fill="FFFFFF"/>
-            <w:tcMar>
-              <w:top w:w="50" w:type="dxa"/>
-              <w:bottom w:w="50" w:type="dxa"/>
-              <w:left w:w="60" w:type="dxa"/>
-              <w:right w:w="60" w:type="dxa"/>
-            </w:tcMar>
-          </w:tcPr>
-          <w:p>
-            <w:pPr>
-              <w:spacing w:line="264" w:lineRule="auto" w:after="40"/>
-            </w:pPr>
-            <w:r>
-              <w:rPr>
-                <w:sz w:val="17"/>
-              </w:rPr>
-              <w:t>Đầy đủ Zod schema, RBAC matrix, token rotation.</w:t>
-            </w:r>
-          </w:p>
-        </w:tc>
-      </w:tr>
-      <w:tr>
-        <w:tc>
-          <w:tcPr>
-            <w:tcW w:type="dxa" w:w="2160"/>
-            <w:shd w:fill="F9FAFC"/>
-            <w:tcMar>
-              <w:top w:w="50" w:type="dxa"/>
-              <w:bottom w:w="50" w:type="dxa"/>
-              <w:left w:w="60" w:type="dxa"/>
-              <w:right w:w="60" w:type="dxa"/>
-            </w:tcMar>
-          </w:tcPr>
-          <w:p>
-            <w:pPr>
-              <w:spacing w:line="264" w:lineRule="auto" w:after="40"/>
-            </w:pPr>
-            <w:r>
-              <w:rPr>
-                <w:sz w:val="17"/>
-              </w:rPr>
-              <w:t>02-analog-master-data.md</w:t>
-            </w:r>
-          </w:p>
-        </w:tc>
-        <w:tc>
-          <w:tcPr>
-            <w:tcW w:type="dxa" w:w="1584"/>
-            <w:shd w:fill="F9FAFC"/>
-            <w:tcMar>
-              <w:top w:w="50" w:type="dxa"/>
-              <w:bottom w:w="50" w:type="dxa"/>
-              <w:left w:w="60" w:type="dxa"/>
-              <w:right w:w="60" w:type="dxa"/>
-            </w:tcMar>
-          </w:tcPr>
-          <w:p>
-            <w:pPr>
-              <w:spacing w:line="264" w:lineRule="auto" w:after="40"/>
-              <w:jc w:val="center"/>
-            </w:pPr>
-            <w:r>
-              <w:rPr>
-                <w:sz w:val="17"/>
-              </w:rPr>
-              <w:t>huynhbao1710</w:t>
-            </w:r>
-          </w:p>
-        </w:tc>
-        <w:tc>
-          <w:tcPr>
-            <w:tcW w:type="dxa" w:w="1584"/>
-            <w:shd w:fill="F9FAFC"/>
-            <w:tcMar>
-              <w:top w:w="50" w:type="dxa"/>
-              <w:bottom w:w="50" w:type="dxa"/>
-              <w:left w:w="60" w:type="dxa"/>
-              <w:right w:w="60" w:type="dxa"/>
-            </w:tcMar>
-          </w:tcPr>
-          <w:p>
-            <w:pPr>
-              <w:spacing w:line="264" w:lineRule="auto" w:after="40"/>
-              <w:jc w:val="center"/>
-            </w:pPr>
-            <w:r>
-              <w:rPr>
-                <w:b/>
-                <w:color w:val="1E7E34"/>
-                <w:sz w:val="17"/>
-              </w:rPr>
-              <w:t>Xuất sắc (5/5)</w:t>
-            </w:r>
-          </w:p>
-        </w:tc>
-        <w:tc>
-          <w:tcPr>
-            <w:tcW w:type="dxa" w:w="1584"/>
-            <w:shd w:fill="F9FAFC"/>
-            <w:tcMar>
-              <w:top w:w="50" w:type="dxa"/>
-              <w:bottom w:w="50" w:type="dxa"/>
-              <w:left w:w="60" w:type="dxa"/>
-              <w:right w:w="60" w:type="dxa"/>
-            </w:tcMar>
-          </w:tcPr>
-          <w:p>
-            <w:pPr>
-              <w:spacing w:line="264" w:lineRule="auto" w:after="40"/>
-            </w:pPr>
-            <w:r>
-              <w:rPr>
-                <w:sz w:val="17"/>
-              </w:rPr>
-              <w:t>100% (BR-22,23)</w:t>
-            </w:r>
-          </w:p>
-        </w:tc>
-        <w:tc>
-          <w:tcPr>
-            <w:tcW w:type="dxa" w:w="2592"/>
-            <w:shd w:fill="F9FAFC"/>
-            <w:tcMar>
-              <w:top w:w="50" w:type="dxa"/>
-              <w:bottom w:w="50" w:type="dxa"/>
-              <w:left w:w="60" w:type="dxa"/>
-              <w:right w:w="60" w:type="dxa"/>
-            </w:tcMar>
-          </w:tcPr>
-          <w:p>
-            <w:pPr>
-              <w:spacing w:line="264" w:lineRule="auto" w:after="40"/>
-            </w:pPr>
-            <w:r>
-              <w:rPr>
-                <w:sz w:val="17"/>
-              </w:rPr>
-              <w:t>Mermaid ERD, Seed data, Zod validation chi tiết.</w:t>
-            </w:r>
-          </w:p>
-        </w:tc>
-      </w:tr>
-      <w:tr>
-        <w:tc>
-          <w:tcPr>
-            <w:tcW w:type="dxa" w:w="2160"/>
-            <w:shd w:fill="FFFFFF"/>
-            <w:tcMar>
-              <w:top w:w="50" w:type="dxa"/>
-              <w:bottom w:w="50" w:type="dxa"/>
-              <w:left w:w="60" w:type="dxa"/>
-              <w:right w:w="60" w:type="dxa"/>
-            </w:tcMar>
-          </w:tcPr>
-          <w:p>
-            <w:pPr>
-              <w:spacing w:line="264" w:lineRule="auto" w:after="40"/>
-            </w:pPr>
-            <w:r>
-              <w:rPr>
-                <w:sz w:val="17"/>
-              </w:rPr>
-              <w:t>04-film-logbook.md</w:t>
-            </w:r>
-          </w:p>
-        </w:tc>
-        <w:tc>
-          <w:tcPr>
-            <w:tcW w:type="dxa" w:w="1584"/>
-            <w:shd w:fill="FFFFFF"/>
-            <w:tcMar>
-              <w:top w:w="50" w:type="dxa"/>
-              <w:bottom w:w="50" w:type="dxa"/>
-              <w:left w:w="60" w:type="dxa"/>
-              <w:right w:w="60" w:type="dxa"/>
-            </w:tcMar>
-          </w:tcPr>
-          <w:p>
-            <w:pPr>
-              <w:spacing w:line="264" w:lineRule="auto" w:after="40"/>
-              <w:jc w:val="center"/>
-            </w:pPr>
-            <w:r>
-              <w:rPr>
-                <w:sz w:val="17"/>
-              </w:rPr>
-              <w:t>truongvi481-cell</w:t>
-            </w:r>
-          </w:p>
-        </w:tc>
-        <w:tc>
-          <w:tcPr>
-            <w:tcW w:type="dxa" w:w="1584"/>
-            <w:shd w:fill="FFFFFF"/>
-            <w:tcMar>
-              <w:top w:w="50" w:type="dxa"/>
-              <w:bottom w:w="50" w:type="dxa"/>
-              <w:left w:w="60" w:type="dxa"/>
-              <w:right w:w="60" w:type="dxa"/>
-            </w:tcMar>
-          </w:tcPr>
-          <w:p>
-            <w:pPr>
-              <w:spacing w:line="264" w:lineRule="auto" w:after="40"/>
-              <w:jc w:val="center"/>
-            </w:pPr>
-            <w:r>
-              <w:rPr>
-                <w:b/>
-                <w:color w:val="D9534F"/>
-                <w:sz w:val="17"/>
-              </w:rPr>
-              <w:t>Trung bình (3/5)</w:t>
-            </w:r>
-          </w:p>
-        </w:tc>
-        <w:tc>
-          <w:tcPr>
-            <w:tcW w:type="dxa" w:w="1584"/>
-            <w:shd w:fill="FFFFFF"/>
-            <w:tcMar>
-              <w:top w:w="50" w:type="dxa"/>
-              <w:bottom w:w="50" w:type="dxa"/>
-              <w:left w:w="60" w:type="dxa"/>
-              <w:right w:w="60" w:type="dxa"/>
-            </w:tcMar>
-          </w:tcPr>
-          <w:p>
-            <w:pPr>
-              <w:spacing w:line="264" w:lineRule="auto" w:after="40"/>
-            </w:pPr>
-            <w:r>
-              <w:rPr>
-                <w:sz w:val="17"/>
-              </w:rPr>
-              <w:t>80% (BR-03,23)</w:t>
-            </w:r>
-          </w:p>
-        </w:tc>
-        <w:tc>
-          <w:tcPr>
-            <w:tcW w:type="dxa" w:w="2592"/>
-            <w:shd w:fill="FFFFFF"/>
-            <w:tcMar>
-              <w:top w:w="50" w:type="dxa"/>
-              <w:bottom w:w="50" w:type="dxa"/>
-              <w:left w:w="60" w:type="dxa"/>
-              <w:right w:w="60" w:type="dxa"/>
-            </w:tcMar>
-          </w:tcPr>
-          <w:p>
-            <w:pPr>
-              <w:spacing w:line="264" w:lineRule="auto" w:after="40"/>
-            </w:pPr>
-            <w:r>
-              <w:rPr>
-                <w:sz w:val="17"/>
-              </w:rPr>
-              <w:t>Sơ sài (~150 dòng), thiếu Zod schema, thiếu API GET/PUT.</w:t>
-            </w:r>
-          </w:p>
-        </w:tc>
-      </w:tr>
-      <w:tr>
-        <w:tc>
-          <w:tcPr>
-            <w:tcW w:type="dxa" w:w="2160"/>
-            <w:shd w:fill="F9FAFC"/>
-            <w:tcMar>
-              <w:top w:w="50" w:type="dxa"/>
-              <w:bottom w:w="50" w:type="dxa"/>
-              <w:left w:w="60" w:type="dxa"/>
-              <w:right w:w="60" w:type="dxa"/>
-            </w:tcMar>
-          </w:tcPr>
-          <w:p>
-            <w:pPr>
-              <w:spacing w:line="264" w:lineRule="auto" w:after="40"/>
-            </w:pPr>
-            <w:r>
-              <w:rPr>
-                <w:sz w:val="17"/>
-              </w:rPr>
-              <w:t>05-submission-and-proof.md</w:t>
-            </w:r>
-          </w:p>
-        </w:tc>
-        <w:tc>
-          <w:tcPr>
-            <w:tcW w:type="dxa" w:w="1584"/>
-            <w:shd w:fill="F9FAFC"/>
-            <w:tcMar>
-              <w:top w:w="50" w:type="dxa"/>
-              <w:bottom w:w="50" w:type="dxa"/>
-              <w:left w:w="60" w:type="dxa"/>
-              <w:right w:w="60" w:type="dxa"/>
-            </w:tcMar>
-          </w:tcPr>
-          <w:p>
-            <w:pPr>
-              <w:spacing w:line="264" w:lineRule="auto" w:after="40"/>
-              <w:jc w:val="center"/>
-            </w:pPr>
-            <w:r>
-              <w:rPr>
-                <w:sz w:val="17"/>
-              </w:rPr>
-              <w:t>truongvi481-cell</w:t>
-            </w:r>
-          </w:p>
-        </w:tc>
-        <w:tc>
-          <w:tcPr>
-            <w:tcW w:type="dxa" w:w="1584"/>
-            <w:shd w:fill="F9FAFC"/>
-            <w:tcMar>
-              <w:top w:w="50" w:type="dxa"/>
-              <w:bottom w:w="50" w:type="dxa"/>
-              <w:left w:w="60" w:type="dxa"/>
-              <w:right w:w="60" w:type="dxa"/>
-            </w:tcMar>
-          </w:tcPr>
-          <w:p>
-            <w:pPr>
-              <w:spacing w:line="264" w:lineRule="auto" w:after="40"/>
-              <w:jc w:val="center"/>
-            </w:pPr>
-            <w:r>
-              <w:rPr>
-                <w:b/>
-                <w:color w:val="D9534F"/>
-                <w:sz w:val="17"/>
-              </w:rPr>
-              <w:t>Trung bình (3/5)</w:t>
-            </w:r>
-          </w:p>
-        </w:tc>
-        <w:tc>
-          <w:tcPr>
-            <w:tcW w:type="dxa" w:w="1584"/>
-            <w:shd w:fill="F9FAFC"/>
-            <w:tcMar>
-              <w:top w:w="50" w:type="dxa"/>
-              <w:bottom w:w="50" w:type="dxa"/>
-              <w:left w:w="60" w:type="dxa"/>
-              <w:right w:w="60" w:type="dxa"/>
-            </w:tcMar>
-          </w:tcPr>
-          <w:p>
-            <w:pPr>
-              <w:spacing w:line="264" w:lineRule="auto" w:after="40"/>
-            </w:pPr>
-            <w:r>
-              <w:rPr>
-                <w:sz w:val="17"/>
-              </w:rPr>
-              <w:t>85% (BR-06,19)</w:t>
-            </w:r>
-          </w:p>
-        </w:tc>
-        <w:tc>
-          <w:tcPr>
-            <w:tcW w:type="dxa" w:w="2592"/>
-            <w:shd w:fill="F9FAFC"/>
-            <w:tcMar>
-              <w:top w:w="50" w:type="dxa"/>
-              <w:bottom w:w="50" w:type="dxa"/>
-              <w:left w:w="60" w:type="dxa"/>
-              <w:right w:w="60" w:type="dxa"/>
-            </w:tcMar>
-          </w:tcPr>
-          <w:p>
-            <w:pPr>
-              <w:spacing w:line="264" w:lineRule="auto" w:after="40"/>
-            </w:pPr>
-            <w:r>
-              <w:rPr>
-                <w:sz w:val="17"/>
-              </w:rPr>
-              <w:t>Sơ sài (~170 dòng), thiếu Zod schema, chưa mô tả Redis event.</w:t>
-            </w:r>
-          </w:p>
-        </w:tc>
-      </w:tr>
-      <w:tr>
-        <w:tc>
-          <w:tcPr>
-            <w:tcW w:type="dxa" w:w="2160"/>
-            <w:shd w:fill="FFFFFF"/>
-            <w:tcMar>
-              <w:top w:w="50" w:type="dxa"/>
-              <w:bottom w:w="50" w:type="dxa"/>
-              <w:left w:w="60" w:type="dxa"/>
-              <w:right w:w="60" w:type="dxa"/>
-            </w:tcMar>
-          </w:tcPr>
-          <w:p>
-            <w:pPr>
-              <w:spacing w:line="264" w:lineRule="auto" w:after="40"/>
-            </w:pPr>
-            <w:r>
-              <w:rPr>
-                <w:sz w:val="17"/>
-              </w:rPr>
-              <w:t>06-ai-verification.md</w:t>
-            </w:r>
-          </w:p>
-        </w:tc>
-        <w:tc>
-          <w:tcPr>
-            <w:tcW w:type="dxa" w:w="1584"/>
-            <w:shd w:fill="FFFFFF"/>
-            <w:tcMar>
-              <w:top w:w="50" w:type="dxa"/>
-              <w:bottom w:w="50" w:type="dxa"/>
-              <w:left w:w="60" w:type="dxa"/>
-              <w:right w:w="60" w:type="dxa"/>
-            </w:tcMar>
-          </w:tcPr>
-          <w:p>
-            <w:pPr>
-              <w:spacing w:line="264" w:lineRule="auto" w:after="40"/>
-              <w:jc w:val="center"/>
-            </w:pPr>
-            <w:r>
-              <w:rPr>
-                <w:sz w:val="17"/>
-              </w:rPr>
-              <w:t>XDamDaddyX</w:t>
-            </w:r>
-          </w:p>
-        </w:tc>
-        <w:tc>
-          <w:tcPr>
-            <w:tcW w:type="dxa" w:w="1584"/>
-            <w:shd w:fill="FFFFFF"/>
-            <w:tcMar>
-              <w:top w:w="50" w:type="dxa"/>
-              <w:bottom w:w="50" w:type="dxa"/>
-              <w:left w:w="60" w:type="dxa"/>
-              <w:right w:w="60" w:type="dxa"/>
-            </w:tcMar>
-          </w:tcPr>
-          <w:p>
-            <w:pPr>
-              <w:spacing w:line="264" w:lineRule="auto" w:after="40"/>
-              <w:jc w:val="center"/>
-            </w:pPr>
-            <w:r>
-              <w:rPr>
-                <w:sz w:val="17"/>
-              </w:rPr>
-              <w:t>Rất xuất sắc (5/5)</w:t>
-            </w:r>
-          </w:p>
-        </w:tc>
-        <w:tc>
-          <w:tcPr>
-            <w:tcW w:type="dxa" w:w="1584"/>
-            <w:shd w:fill="FFFFFF"/>
-            <w:tcMar>
-              <w:top w:w="50" w:type="dxa"/>
-              <w:bottom w:w="50" w:type="dxa"/>
-              <w:left w:w="60" w:type="dxa"/>
-              <w:right w:w="60" w:type="dxa"/>
-            </w:tcMar>
-          </w:tcPr>
-          <w:p>
-            <w:pPr>
-              <w:spacing w:line="264" w:lineRule="auto" w:after="40"/>
-            </w:pPr>
-            <w:r>
-              <w:rPr>
-                <w:sz w:val="17"/>
-              </w:rPr>
-              <w:t>100% (BR-09,10,11)</w:t>
-            </w:r>
-          </w:p>
-        </w:tc>
-        <w:tc>
-          <w:tcPr>
-            <w:tcW w:type="dxa" w:w="2592"/>
-            <w:shd w:fill="FFFFFF"/>
-            <w:tcMar>
-              <w:top w:w="50" w:type="dxa"/>
-              <w:bottom w:w="50" w:type="dxa"/>
-              <w:left w:w="60" w:type="dxa"/>
-              <w:right w:w="60" w:type="dxa"/>
-            </w:tcMar>
-          </w:tcPr>
-          <w:p>
-            <w:pPr>
-              <w:spacing w:line="264" w:lineRule="auto" w:after="40"/>
-            </w:pPr>
-            <w:r>
-              <w:rPr>
-                <w:sz w:val="17"/>
-              </w:rPr>
-              <w:t>Thiết kế mẫu mực: pgvector, pHash, P_AI &gt;= 75%, Redis Worker.</w:t>
-            </w:r>
-          </w:p>
-        </w:tc>
-      </w:tr>
-      <w:tr>
-        <w:tc>
-          <w:tcPr>
-            <w:tcW w:type="dxa" w:w="2160"/>
-            <w:shd w:fill="F9FAFC"/>
-            <w:tcMar>
-              <w:top w:w="50" w:type="dxa"/>
-              <w:bottom w:w="50" w:type="dxa"/>
-              <w:left w:w="60" w:type="dxa"/>
-              <w:right w:w="60" w:type="dxa"/>
-            </w:tcMar>
-          </w:tcPr>
-          <w:p>
-            <w:pPr>
-              <w:spacing w:line="264" w:lineRule="auto" w:after="40"/>
-            </w:pPr>
-            <w:r>
-              <w:rPr>
-                <w:sz w:val="17"/>
-              </w:rPr>
-              <w:t>08-archive-and-exhibition.md</w:t>
-            </w:r>
-          </w:p>
-        </w:tc>
-        <w:tc>
-          <w:tcPr>
-            <w:tcW w:type="dxa" w:w="1584"/>
-            <w:shd w:fill="F9FAFC"/>
-            <w:tcMar>
-              <w:top w:w="50" w:type="dxa"/>
-              <w:bottom w:w="50" w:type="dxa"/>
-              <w:left w:w="60" w:type="dxa"/>
-              <w:right w:w="60" w:type="dxa"/>
-            </w:tcMar>
-          </w:tcPr>
-          <w:p>
-            <w:pPr>
-              <w:spacing w:line="264" w:lineRule="auto" w:after="40"/>
-              <w:jc w:val="center"/>
-            </w:pPr>
-            <w:r>
-              <w:rPr>
-                <w:sz w:val="17"/>
-              </w:rPr>
-              <w:t>binhhd796108-star</w:t>
-            </w:r>
-          </w:p>
-        </w:tc>
-        <w:tc>
-          <w:tcPr>
-            <w:tcW w:type="dxa" w:w="1584"/>
-            <w:shd w:fill="F9FAFC"/>
-            <w:tcMar>
-              <w:top w:w="50" w:type="dxa"/>
-              <w:bottom w:w="50" w:type="dxa"/>
-              <w:left w:w="60" w:type="dxa"/>
-              <w:right w:w="60" w:type="dxa"/>
-            </w:tcMar>
-          </w:tcPr>
-          <w:p>
-            <w:pPr>
-              <w:spacing w:line="264" w:lineRule="auto" w:after="40"/>
-              <w:jc w:val="center"/>
-            </w:pPr>
-            <w:r>
-              <w:rPr>
-                <w:sz w:val="17"/>
-              </w:rPr>
-              <w:t>Rất tốt (4.5/5)</w:t>
-            </w:r>
-          </w:p>
-        </w:tc>
-        <w:tc>
-          <w:tcPr>
-            <w:tcW w:type="dxa" w:w="1584"/>
-            <w:shd w:fill="F9FAFC"/>
-            <w:tcMar>
-              <w:top w:w="50" w:type="dxa"/>
-              <w:bottom w:w="50" w:type="dxa"/>
-              <w:left w:w="60" w:type="dxa"/>
-              <w:right w:w="60" w:type="dxa"/>
-            </w:tcMar>
-          </w:tcPr>
-          <w:p>
-            <w:pPr>
-              <w:spacing w:line="264" w:lineRule="auto" w:after="40"/>
-            </w:pPr>
-            <w:r>
-              <w:rPr>
-                <w:sz w:val="17"/>
-              </w:rPr>
-              <w:t>100% (BR-16,17)</w:t>
-            </w:r>
-          </w:p>
-        </w:tc>
-        <w:tc>
-          <w:tcPr>
-            <w:tcW w:type="dxa" w:w="2592"/>
-            <w:shd w:fill="F9FAFC"/>
-            <w:tcMar>
-              <w:top w:w="50" w:type="dxa"/>
-              <w:bottom w:w="50" w:type="dxa"/>
-              <w:left w:w="60" w:type="dxa"/>
-              <w:right w:w="60" w:type="dxa"/>
-            </w:tcMar>
-          </w:tcPr>
-          <w:p>
-            <w:pPr>
-              <w:spacing w:line="264" w:lineRule="auto" w:after="40"/>
-            </w:pPr>
-            <w:r>
-              <w:rPr>
-                <w:sz w:val="17"/>
-              </w:rPr>
-              <w:t>Triển lãm số, Faceted search, bảo vệ ảnh gốc.</w:t>
-            </w:r>
-          </w:p>
-        </w:tc>
-      </w:tr>
-      <w:tr>
-        <w:tc>
-          <w:tcPr>
-            <w:tcW w:type="dxa" w:w="2160"/>
-            <w:shd w:fill="FFFFFF"/>
-            <w:tcMar>
-              <w:top w:w="50" w:type="dxa"/>
-              <w:bottom w:w="50" w:type="dxa"/>
-              <w:left w:w="60" w:type="dxa"/>
-              <w:right w:w="60" w:type="dxa"/>
-            </w:tcMar>
-          </w:tcPr>
-          <w:p>
-            <w:pPr>
-              <w:spacing w:line="264" w:lineRule="auto" w:after="40"/>
-            </w:pPr>
-            <w:r>
-              <w:rPr>
-                <w:sz w:val="17"/>
-              </w:rPr>
-              <w:t>09-api-contracts.md</w:t>
-            </w:r>
-          </w:p>
-        </w:tc>
-        <w:tc>
-          <w:tcPr>
-            <w:tcW w:type="dxa" w:w="1584"/>
-            <w:shd w:fill="FFFFFF"/>
-            <w:tcMar>
-              <w:top w:w="50" w:type="dxa"/>
-              <w:bottom w:w="50" w:type="dxa"/>
-              <w:left w:w="60" w:type="dxa"/>
-              <w:right w:w="60" w:type="dxa"/>
-            </w:tcMar>
-          </w:tcPr>
-          <w:p>
-            <w:pPr>
-              <w:spacing w:line="264" w:lineRule="auto" w:after="40"/>
-              <w:jc w:val="center"/>
-            </w:pPr>
-            <w:r>
-              <w:rPr>
-                <w:sz w:val="17"/>
-              </w:rPr>
-              <w:t>binhhd796108-star</w:t>
-            </w:r>
-          </w:p>
-        </w:tc>
-        <w:tc>
-          <w:tcPr>
-            <w:tcW w:type="dxa" w:w="1584"/>
-            <w:shd w:fill="FFFFFF"/>
-            <w:tcMar>
-              <w:top w:w="50" w:type="dxa"/>
-              <w:bottom w:w="50" w:type="dxa"/>
-              <w:left w:w="60" w:type="dxa"/>
-              <w:right w:w="60" w:type="dxa"/>
-            </w:tcMar>
-          </w:tcPr>
-          <w:p>
-            <w:pPr>
-              <w:spacing w:line="264" w:lineRule="auto" w:after="40"/>
-              <w:jc w:val="center"/>
-            </w:pPr>
-            <w:r>
-              <w:rPr>
-                <w:sz w:val="17"/>
-              </w:rPr>
-              <w:t>Rất tốt (4.5/5)</w:t>
-            </w:r>
-          </w:p>
-        </w:tc>
-        <w:tc>
-          <w:tcPr>
-            <w:tcW w:type="dxa" w:w="1584"/>
-            <w:shd w:fill="FFFFFF"/>
-            <w:tcMar>
-              <w:top w:w="50" w:type="dxa"/>
-              <w:bottom w:w="50" w:type="dxa"/>
-              <w:left w:w="60" w:type="dxa"/>
-              <w:right w:w="60" w:type="dxa"/>
-            </w:tcMar>
-          </w:tcPr>
-          <w:p>
-            <w:pPr>
-              <w:spacing w:line="264" w:lineRule="auto" w:after="40"/>
-            </w:pPr>
-            <w:r>
-              <w:rPr>
-                <w:sz w:val="17"/>
-              </w:rPr>
-              <w:t>100% (CR-01,06)</w:t>
-            </w:r>
-          </w:p>
-        </w:tc>
-        <w:tc>
-          <w:tcPr>
-            <w:tcW w:type="dxa" w:w="2592"/>
-            <w:shd w:fill="FFFFFF"/>
-            <w:tcMar>
-              <w:top w:w="50" w:type="dxa"/>
-              <w:bottom w:w="50" w:type="dxa"/>
-              <w:left w:w="60" w:type="dxa"/>
-              <w:right w:w="60" w:type="dxa"/>
-            </w:tcMar>
-          </w:tcPr>
-          <w:p>
-            <w:pPr>
-              <w:spacing w:line="264" w:lineRule="auto" w:after="40"/>
-            </w:pPr>
-            <w:r>
-              <w:rPr>
-                <w:sz w:val="17"/>
-              </w:rPr>
-              <w:t>Chuẩn hóa Envelope Response, DTOs chung toàn hệ thống.</w:t>
-            </w:r>
-          </w:p>
-        </w:tc>
-      </w:tr>
-      <w:tr>
-        <w:tc>
-          <w:tcPr>
-            <w:tcW w:type="dxa" w:w="2160"/>
-            <w:shd w:fill="F9FAFC"/>
-            <w:tcMar>
-              <w:top w:w="50" w:type="dxa"/>
-              <w:bottom w:w="50" w:type="dxa"/>
-              <w:left w:w="60" w:type="dxa"/>
-              <w:right w:w="60" w:type="dxa"/>
-            </w:tcMar>
-          </w:tcPr>
-          <w:p>
-            <w:pPr>
-              <w:spacing w:line="264" w:lineRule="auto" w:after="40"/>
-            </w:pPr>
-            <w:r>
-              <w:rPr>
-                <w:sz w:val="17"/>
-              </w:rPr>
-              <w:t>10-database-and-storage.md</w:t>
-            </w:r>
-          </w:p>
-        </w:tc>
-        <w:tc>
-          <w:tcPr>
-            <w:tcW w:type="dxa" w:w="1584"/>
-            <w:shd w:fill="F9FAFC"/>
-            <w:tcMar>
-              <w:top w:w="50" w:type="dxa"/>
-              <w:bottom w:w="50" w:type="dxa"/>
-              <w:left w:w="60" w:type="dxa"/>
-              <w:right w:w="60" w:type="dxa"/>
-            </w:tcMar>
-          </w:tcPr>
-          <w:p>
-            <w:pPr>
-              <w:spacing w:line="264" w:lineRule="auto" w:after="40"/>
-              <w:jc w:val="center"/>
-            </w:pPr>
-            <w:r>
-              <w:rPr>
-                <w:sz w:val="17"/>
-              </w:rPr>
-              <w:t>XDamDaddyX</w:t>
-            </w:r>
-          </w:p>
-        </w:tc>
-        <w:tc>
-          <w:tcPr>
-            <w:tcW w:type="dxa" w:w="1584"/>
-            <w:shd w:fill="F9FAFC"/>
-            <w:tcMar>
-              <w:top w:w="50" w:type="dxa"/>
-              <w:bottom w:w="50" w:type="dxa"/>
-              <w:left w:w="60" w:type="dxa"/>
-              <w:right w:w="60" w:type="dxa"/>
-            </w:tcMar>
-          </w:tcPr>
-          <w:p>
-            <w:pPr>
-              <w:spacing w:line="264" w:lineRule="auto" w:after="40"/>
-              <w:jc w:val="center"/>
-            </w:pPr>
-            <w:r>
-              <w:rPr>
-                <w:sz w:val="17"/>
-              </w:rPr>
-              <w:t>Rất tốt (4.5/5)</w:t>
-            </w:r>
-          </w:p>
-        </w:tc>
-        <w:tc>
-          <w:tcPr>
-            <w:tcW w:type="dxa" w:w="1584"/>
-            <w:shd w:fill="F9FAFC"/>
-            <w:tcMar>
-              <w:top w:w="50" w:type="dxa"/>
-              <w:bottom w:w="50" w:type="dxa"/>
-              <w:left w:w="60" w:type="dxa"/>
-              <w:right w:w="60" w:type="dxa"/>
-            </w:tcMar>
-          </w:tcPr>
-          <w:p>
-            <w:pPr>
-              <w:spacing w:line="264" w:lineRule="auto" w:after="40"/>
-            </w:pPr>
-            <w:r>
-              <w:rPr>
-                <w:sz w:val="17"/>
-              </w:rPr>
-              <w:t>100% (PostgreSQL)</w:t>
-            </w:r>
-          </w:p>
-        </w:tc>
-        <w:tc>
-          <w:tcPr>
-            <w:tcW w:type="dxa" w:w="2592"/>
-            <w:shd w:fill="F9FAFC"/>
-            <w:tcMar>
-              <w:top w:w="50" w:type="dxa"/>
-              <w:bottom w:w="50" w:type="dxa"/>
-              <w:left w:w="60" w:type="dxa"/>
-              <w:right w:w="60" w:type="dxa"/>
-            </w:tcMar>
-          </w:tcPr>
-          <w:p>
-            <w:pPr>
-              <w:spacing w:line="264" w:lineRule="auto" w:after="40"/>
-            </w:pPr>
-            <w:r>
-              <w:rPr>
-                <w:sz w:val="17"/>
-              </w:rPr>
-              <w:t>PostgreSQL 16 + pgvector, presigned URL Cloudflare R2.</w:t>
+              <w:t>Hoàng Nam (Technical Lead)</w:t>
             </w:r>
           </w:p>
         </w:tc>
       </w:tr>
     </w:tbl>
-    <w:p>
-      <w:pPr>
-        <w:spacing w:after="120"/>
-      </w:pPr>
-    </w:p>
-    <w:p>
-      <w:pPr>
-        <w:keepNext/>
-        <w:spacing w:before="240" w:after="100"/>
-      </w:pPr>
-      <w:r>
-        <w:rPr>
-          <w:b/>
-          <w:color w:val="1F4E78"/>
-          <w:sz w:val="24"/>
-        </w:rPr>
-        <w:t>IV. CÁC LỖI TỒN ĐỌNG &amp; VẤN ĐỀ KỸ THUẬT CẦN KHẮC PHỤC</w:t>
-      </w:r>
-    </w:p>
-    <w:p>
-      <w:pPr>
-        <w:pStyle w:val="ListBullet"/>
-        <w:spacing w:after="40"/>
-      </w:pPr>
-      <w:r>
-        <w:rPr>
-          <w:b/>
-        </w:rPr>
-        <w:t xml:space="preserve">Chênh lệch chất lượng tài liệu giữa các tác giả: </w:t>
-      </w:r>
-      <w:r>
-        <w:t>Module 04 và 05 của tác giả truongvi481-cell được viết quá vắn tắt (chỉ khoảng 150-170 dòng), thiếu Zod Validation Schema chi tiết, API contracts chỉ liệt kê 2-3 endpoint cơ bản (thiếu hẳn các endpoint GET danh sách, GET chi tiết, PUT cập nhật, DELETE xóa mềm cuộn phim/frame).</w:t>
-      </w:r>
-    </w:p>
-    <w:p>
-      <w:pPr>
-        <w:pStyle w:val="ListBullet"/>
-        <w:spacing w:after="40"/>
-      </w:pPr>
-      <w:r>
-        <w:rPr>
-          <w:b/>
-        </w:rPr>
-        <w:t xml:space="preserve">Bất nhất trong quy ước đặt tên thực thể (Naming Convention): </w:t>
-      </w:r>
-      <w:r>
-        <w:t>Trong Module 04 và 05 sử dụng tên bảng dạng PascalCase (FilmRoll, FilmFrame, Submission), trong khi chuẩn toàn dự án và các module 01, 02, 06, 10 cũng như code thực tế trong apps/api/src/db/schema.ts đều thống nhất dùng snake_case (film_rolls, film_frames, submissions). Cần chuẩn hóa lại để AI sinh code không bị lỗi gõ nhầm bảng.</w:t>
-      </w:r>
-    </w:p>
-    <w:p>
-      <w:pPr>
-        <w:pStyle w:val="ListBullet"/>
-        <w:spacing w:after="40"/>
-      </w:pPr>
-      <w:r>
-        <w:rPr>
-          <w:b/>
-        </w:rPr>
-        <w:t xml:space="preserve">Thiếu sót 2 module quan trọng chưa thể merge: </w:t>
-      </w:r>
-      <w:r>
-        <w:t>Module 03 (Vòng đời cuộc thi - FPC-128) và Module 07 (Chấm thi ẩn danh - FPC-129) hiện vẫn chưa có mặt trên develop do thành viên phụ trách chưa hoàn thành đúng chất lượng.</w:t>
-      </w:r>
-    </w:p>
-    <w:p>
-      <w:pPr>
-        <w:keepNext/>
-        <w:spacing w:before="240" w:after="100"/>
-      </w:pPr>
-      <w:r>
-        <w:rPr>
-          <w:b/>
-          <w:color w:val="1F4E78"/>
-          <w:sz w:val="24"/>
-        </w:rPr>
-        <w:t>V. ĐÁNH GIÁ &amp; GHI NHẬN ĐẶC BIỆT VỀ THÀNH VIÊN DƯƠNG NGUYỄN (syduong009)</w:t>
-      </w:r>
-    </w:p>
-    <w:tbl>
-      <w:tblPr>
-        <w:tblW w:type="auto" w:w="0"/>
-        <w:jc w:val="center"/>
-        <w:tblLook w:firstColumn="1" w:firstRow="1" w:lastColumn="0" w:lastRow="0" w:noHBand="0" w:noVBand="1" w:val="04A0"/>
-      </w:tblPr>
-      <w:tblGrid>
-        <w:gridCol w:w="9936"/>
-      </w:tblGrid>
-      <w:tr>
-        <w:tc>
-          <w:tcPr>
-            <w:tcW w:type="dxa" w:w="9504"/>
-            <w:shd w:fill="FDF2E9"/>
-            <w:tcMar>
-              <w:top w:w="90" w:type="dxa"/>
-              <w:bottom w:w="90" w:type="dxa"/>
-              <w:left w:w="120" w:type="dxa"/>
-              <w:right w:w="120" w:type="dxa"/>
-            </w:tcMar>
-          </w:tcPr>
-          <w:p>
-            <w:pPr>
-              <w:spacing w:after="60"/>
-            </w:pPr>
-            <w:r>
-              <w:rPr>
-                <w:b/>
-                <w:color w:val="B94A04"/>
-                <w:sz w:val="21"/>
-              </w:rPr>
-              <w:t>⚠️ CẢNH BÁO KỸ THUẬT &amp; QUY TRÌNH: THÀNH VIÊN DƯƠNG NGUYỄN (syduong009)</w:t>
-            </w:r>
-          </w:p>
-          <w:p>
-            <w:pPr>
-              <w:spacing w:after="40"/>
-            </w:pPr>
-            <w:r>
-              <w:rPr>
-                <w:b/>
-              </w:rPr>
-              <w:t xml:space="preserve">Được phân công phụ trách 2 ticket quan trọng: </w:t>
-            </w:r>
-            <w:r>
-              <w:t>FPC-128 (03-contest-lifecycle.md) và FPC-129 (07-blind-judging.md). Qua kiểm tra, thành viên này liên tục mắc các sai sót nghiêm trọng về cả quy trình vận hành Git lẫn chất lượng tài liệu:</w:t>
-            </w:r>
-          </w:p>
-          <w:p>
-            <w:pPr>
-              <w:pStyle w:val="ListBullet"/>
-              <w:spacing w:after="40"/>
-            </w:pPr>
-            <w:r>
-              <w:rPr>
-                <w:b/>
-              </w:rPr>
-              <w:t xml:space="preserve">Vi phạm quy trình làm việc Git/GitHub (Không mở Pull Request): </w:t>
-            </w:r>
-            <w:r>
-              <w:t>Dương Nguyễn đã commit và push nhánh cá nhân lên remote (origin/feature/FPC-128-contest-lifecycle-docs và origin/feature/FPC-129-blind-judging-docs), nhưng KHÔNG HỀ TẠO PULL REQUEST (PR) trên GitHub. Trên bảng quản lý Jira/Sprint chỉ hiển thị icon commit, hoàn toàn không có PR link, dẫn đến tình trạng Lead và đồng đội không thể thực hiện review/merge trên giao diện GitHub.</w:t>
-            </w:r>
-          </w:p>
-          <w:p>
-            <w:pPr>
-              <w:pStyle w:val="ListBullet"/>
-              <w:spacing w:after="40"/>
-            </w:pPr>
-            <w:r>
-              <w:rPr>
-                <w:b/>
-              </w:rPr>
-              <w:t xml:space="preserve">Tài liệu sơ sài, cẩu thả, không tuân thủ quy chuẩn AI-First: </w:t>
-            </w:r>
-            <w:r>
-              <w:t>Mỗi tài liệu chỉ dài vỏn vẹn 80 - 86 dòng (kém xa mức yêu cầu tối thiểu). Hoàn toàn THIẾU 3 MỤC CỐT LÕI: (1) Domain Entities &amp; Database Mapping, (2) Shared API Contracts (Zod schema, DTOs, Error codes), (3) UI/UX Functional Requirements. Nội dung không đủ điều kiện để AI hoặc lập trình viên tiến hành sinh code.</w:t>
-            </w:r>
-          </w:p>
-          <w:p>
-            <w:pPr>
-              <w:pStyle w:val="ListBullet"/>
-              <w:spacing w:after="40"/>
-            </w:pPr>
-            <w:r>
-              <w:rPr>
-                <w:b/>
-              </w:rPr>
-              <w:t xml:space="preserve">Thiếu tư duy AI-First &amp; Bỏ sót yêu cầu nghiệp vụ: </w:t>
-            </w:r>
-            <w:r>
-              <w:t>Ở Module 03, hoàn toàn bỏ qua việc cấu hình các tham số ngưỡng AI (P_AI threshold, pHash Hamming distance theo UC-09) khi Organizer khởi tạo cuộc thi, và bỏ qua khâu tự động kích hoạt AI Worker kiểm duyệt trong vòng đời bài thi. Ở Module 07, chỉ liệt kê lại vài công thức toán học một cách cơ bản, thiếu hoàn toàn cơ chế Data Anonymization Filter ở backend DTO layer để bảo vệ tính ẩn danh kép.</w:t>
-            </w:r>
-          </w:p>
-          <w:p>
-            <w:pPr>
-              <w:pStyle w:val="ListBullet"/>
-              <w:spacing w:after="40"/>
-            </w:pPr>
-            <w:r>
-              <w:rPr>
-                <w:b/>
-              </w:rPr>
-              <w:t xml:space="preserve">Thái độ làm việc mơ hồ, đùn đẩy trách nhiệm: </w:t>
-            </w:r>
-            <w:r>
-              <w:t>Thay vì đối chiếu kỹ lưỡng tài liệu SRS để đặc tả logic xác định (deterministic), Dương Nguyễn lại ghi các câu thiếu trách nhiệm vào tài liệu như: 'The detailed triggers... should be confirmed with the team' hay 'SRS clarification... should be confirmed with the team'.</w:t>
-            </w:r>
-          </w:p>
-          <w:p>
-            <w:pPr>
-              <w:pStyle w:val="ListBullet"/>
-              <w:spacing w:after="40"/>
-            </w:pPr>
-            <w:r>
-              <w:rPr>
-                <w:b/>
-              </w:rPr>
-              <w:t xml:space="preserve">Lịch sử công việc: </w:t>
-            </w:r>
-            <w:r>
-              <w:t>Thành viên này thường xuyên làm việc thiếu cẩn thận, không đọc kỹ tài liệu yêu cầu và hướng dẫn của Lead, sản phẩm đầu ra nhiều lỗi và thiếu chính xác, gây ảnh hưởng trực tiếp đến tiến độ chung của monorepo.</w:t>
-            </w:r>
-          </w:p>
-        </w:tc>
-      </w:tr>
-    </w:tbl>
-    <w:p>
-      <w:pPr>
-        <w:spacing w:after="120"/>
-      </w:pPr>
-    </w:p>
-    <w:p>
-      <w:pPr>
-        <w:keepNext/>
-        <w:spacing w:before="240" w:after="100"/>
-      </w:pPr>
-      <w:r>
-        <w:rPr>
-          <w:b/>
-          <w:color w:val="1F4E78"/>
-          <w:sz w:val="24"/>
-        </w:rPr>
-        <w:t>VI. KẾ HOẠCH HÀNH ĐỘNG TIẾP THEO (ACTION ITEMS)</w:t>
-      </w:r>
-    </w:p>
-    <w:p>
-      <w:pPr>
-        <w:pStyle w:val="ListBullet"/>
-        <w:spacing w:after="40"/>
-      </w:pPr>
-      <w:r>
-        <w:rPr>
-          <w:b/>
-        </w:rPr>
-        <w:t xml:space="preserve">Xử lý đối với thành viên Dương Nguyễn: </w:t>
-      </w:r>
-      <w:r>
-        <w:t>Yêu cầu Dương Nguyễn đọc kỹ tài liệu mẫu (01-auth-and-rbac.md và 06-ai-verification.md), viết lại toàn bộ 2 module 03 và 07 theo đúng cấu trúc 5 phần chuẩn AI-First, sau đó tự tạo Pull Request chính thức trên GitHub trước 18:00 ngày 29/10/2026.</w:t>
-      </w:r>
-    </w:p>
-    <w:p>
-      <w:pPr>
-        <w:pStyle w:val="ListBullet"/>
-        <w:spacing w:after="40"/>
-      </w:pPr>
-      <w:r>
-        <w:rPr>
-          <w:b/>
-        </w:rPr>
-        <w:t xml:space="preserve">Cải thiện Module 04 &amp; 05: </w:t>
-      </w:r>
-      <w:r>
-        <w:t>Yêu cầu tác giả truongvi481-cell bổ sung đầy đủ Zod Validation Schemas, các API endpoints CRUD còn thiếu và đặc tả rõ luồng bắn event sang Redis AI Worker.</w:t>
-      </w:r>
-    </w:p>
-    <w:p>
-      <w:pPr>
-        <w:pStyle w:val="ListBullet"/>
-        <w:spacing w:after="40"/>
-      </w:pPr>
-      <w:r>
-        <w:rPr>
-          <w:b/>
-        </w:rPr>
-        <w:t xml:space="preserve">Đồng bộ hóa Naming Convention: </w:t>
-      </w:r>
-      <w:r>
-        <w:t>Rà soát toàn bộ tài liệu spec để đồng nhất 100% tên bảng sang snake_case theo chuẩn schema PostgreSQL hiện có trong apps/api/src/db/schema.ts.</w:t>
-      </w:r>
-    </w:p>
-    <w:p>
-      <w:pPr>
-        <w:pStyle w:val="ListBullet"/>
-        <w:spacing w:after="40"/>
-      </w:pPr>
-      <w:r>
-        <w:rPr>
-          <w:b/>
-        </w:rPr>
-        <w:t xml:space="preserve">Khởi động Sprint Code Generation: </w:t>
-      </w:r>
-      <w:r>
-        <w:t>Sau khi hoàn tất đủ 10/10 module specs đạt chuẩn AI-First, nhóm sẽ tiến hành dùng AI Assistants để sinh mã nguồn đồng bộ cho Backend Hono, Web Next.js và Mobile Flutter.</w:t>
-      </w:r>
-    </w:p>
-    <w:p>
-      <w:pPr>
-        <w:spacing w:after="200"/>
-      </w:pPr>
-    </w:p>
-    <w:p>
-      <w:pPr>
-        <w:jc w:val="right"/>
-      </w:pPr>
-      <w:r>
-        <w:rPr>
-          <w:i/>
-        </w:rPr>
-        <w:t>Báo cáo được lập &amp; xác nhận bởi:</w:t>
-        <w:br/>
-      </w:r>
-      <w:r>
-        <w:rPr>
-          <w:b/>
-          <w:color w:val="1F4E78"/>
-          <w:sz w:val="21"/>
-        </w:rPr>
-        <w:t>Hoàng Nam (Technical Lead)</w:t>
-      </w:r>
-    </w:p>
     <w:sectPr>
       <w:pgSz w:w="12240" w:h="15840"/>
-      <w:pgMar w:top="1152" w:right="1152" w:bottom="1152" w:left="1152" w:header="720" w:footer="720" w:gutter="0"/>
+      <w:pgMar w:top="936" w:right="936" w:bottom="936" w:left="936" w:header="720" w:footer="720" w:gutter="0"/>
       <w:cols w:space="720"/>
       <w:docGrid w:linePitch="360"/>
     </w:sectPr>
@@ -2514,14 +3252,6 @@
     <w:name w:val="Normal"/>
     <w:qFormat/>
     <w:rsid w:val="00FC693F"/>
-    <w:pPr>
-      <w:spacing w:line="276" w:lineRule="auto" w:after="80"/>
-    </w:pPr>
-    <w:rPr>
-      <w:rFonts w:ascii="Arial" w:hAnsi="Arial"/>
-      <w:color w:val="333333"/>
-      <w:sz w:val="20"/>
-    </w:rPr>
   </w:style>
   <w:style w:type="paragraph" w:styleId="Header">
     <w:name w:val="header"/>

</xml_diff>